<commit_message>
learn about data and dbms and need of it and its adv disadv
</commit_message>
<xml_diff>
--- a/DBMS/DBMS NOTES.docx
+++ b/DBMS/DBMS NOTES.docx
@@ -2206,7 +2206,7 @@
     <w:p>
       <w:r>
         <w:pict w14:anchorId="7DCBAB22">
-          <v:rect id="_x0000_i1028" style="width:0;height:1.5pt" o:hralign="center" o:bullet="t" o:hrstd="t" o:hr="t" fillcolor="#a0a0a0" stroked="f"/>
+          <v:rect id="_x0000_i1026" style="width:0;height:1.5pt" o:hralign="center" o:bullet="t" o:hrstd="t" o:hr="t" fillcolor="#a0a0a0" stroked="f"/>
         </w:pict>
       </w:r>
     </w:p>
@@ -2249,6 +2249,2610 @@
           <w:u w:val="single"/>
         </w:rPr>
         <w:t>)</w:t>
+      </w:r>
+    </w:p>
+    <w:p>
+      <w:pPr>
+        <w:rPr>
+          <w:b/>
+          <w:bCs/>
+        </w:rPr>
+      </w:pPr>
+      <w:r>
+        <w:rPr>
+          <w:b/>
+          <w:bCs/>
+        </w:rPr>
+        <w:t>Types of Databases (An Overview)</w:t>
+      </w:r>
+    </w:p>
+    <w:p>
+      <w:r>
+        <w:t xml:space="preserve">Database ko hum </w:t>
+      </w:r>
+      <w:proofErr w:type="spellStart"/>
+      <w:r>
+        <w:t>unke</w:t>
+      </w:r>
+      <w:proofErr w:type="spellEnd"/>
+      <w:r>
+        <w:t xml:space="preserve"> structure aur data store </w:t>
+      </w:r>
+      <w:proofErr w:type="spellStart"/>
+      <w:r>
+        <w:t>karne</w:t>
+      </w:r>
+      <w:proofErr w:type="spellEnd"/>
+      <w:r>
+        <w:t xml:space="preserve"> </w:t>
+      </w:r>
+      <w:proofErr w:type="spellStart"/>
+      <w:r>
+        <w:t>ke</w:t>
+      </w:r>
+      <w:proofErr w:type="spellEnd"/>
+      <w:r>
+        <w:t xml:space="preserve"> </w:t>
+      </w:r>
+      <w:proofErr w:type="spellStart"/>
+      <w:r>
+        <w:t>tareeke</w:t>
+      </w:r>
+      <w:proofErr w:type="spellEnd"/>
+      <w:r>
+        <w:t xml:space="preserve"> </w:t>
+      </w:r>
+      <w:proofErr w:type="spellStart"/>
+      <w:r>
+        <w:t>ke</w:t>
+      </w:r>
+      <w:proofErr w:type="spellEnd"/>
+      <w:r>
+        <w:t xml:space="preserve"> </w:t>
+      </w:r>
+      <w:proofErr w:type="spellStart"/>
+      <w:r>
+        <w:t>hisaab</w:t>
+      </w:r>
+      <w:proofErr w:type="spellEnd"/>
+      <w:r>
+        <w:t xml:space="preserve"> se </w:t>
+      </w:r>
+      <w:proofErr w:type="spellStart"/>
+      <w:r>
+        <w:t>alag-alag</w:t>
+      </w:r>
+      <w:proofErr w:type="spellEnd"/>
+      <w:r>
+        <w:t xml:space="preserve"> categories </w:t>
+      </w:r>
+      <w:proofErr w:type="spellStart"/>
+      <w:r>
+        <w:t>mein</w:t>
+      </w:r>
+      <w:proofErr w:type="spellEnd"/>
+      <w:r>
+        <w:t xml:space="preserve"> divide </w:t>
+      </w:r>
+      <w:proofErr w:type="spellStart"/>
+      <w:r>
+        <w:t>karte</w:t>
+      </w:r>
+      <w:proofErr w:type="spellEnd"/>
+      <w:r>
+        <w:t xml:space="preserve"> hain:</w:t>
+      </w:r>
+    </w:p>
+    <w:p>
+      <w:pPr>
+        <w:numPr>
+          <w:ilvl w:val="0"/>
+          <w:numId w:val="6"/>
+        </w:numPr>
+      </w:pPr>
+      <w:r>
+        <w:rPr>
+          <w:b/>
+          <w:bCs/>
+        </w:rPr>
+        <w:t>Relational Database (RDBMS):</w:t>
+      </w:r>
+      <w:r>
+        <w:t xml:space="preserve"> Ye </w:t>
+      </w:r>
+      <w:proofErr w:type="spellStart"/>
+      <w:r>
+        <w:t>sabse</w:t>
+      </w:r>
+      <w:proofErr w:type="spellEnd"/>
+      <w:r>
+        <w:t xml:space="preserve"> </w:t>
+      </w:r>
+      <w:proofErr w:type="spellStart"/>
+      <w:r>
+        <w:t>zyada</w:t>
+      </w:r>
+      <w:proofErr w:type="spellEnd"/>
+      <w:r>
+        <w:t xml:space="preserve"> use hone </w:t>
+      </w:r>
+      <w:proofErr w:type="spellStart"/>
+      <w:r>
+        <w:t>wala</w:t>
+      </w:r>
+      <w:proofErr w:type="spellEnd"/>
+      <w:r>
+        <w:t xml:space="preserve"> database </w:t>
+      </w:r>
+      <w:proofErr w:type="spellStart"/>
+      <w:r>
+        <w:t>hai</w:t>
+      </w:r>
+      <w:proofErr w:type="spellEnd"/>
+      <w:r>
+        <w:t>.</w:t>
+      </w:r>
+    </w:p>
+    <w:p>
+      <w:pPr>
+        <w:numPr>
+          <w:ilvl w:val="1"/>
+          <w:numId w:val="6"/>
+        </w:numPr>
+      </w:pPr>
+      <w:r>
+        <w:rPr>
+          <w:b/>
+          <w:bCs/>
+        </w:rPr>
+        <w:t>Structure:</w:t>
+      </w:r>
+      <w:r>
+        <w:t xml:space="preserve"> Data ko "Tables" </w:t>
+      </w:r>
+      <w:proofErr w:type="spellStart"/>
+      <w:r>
+        <w:t>mein</w:t>
+      </w:r>
+      <w:proofErr w:type="spellEnd"/>
+      <w:r>
+        <w:t xml:space="preserve"> store </w:t>
+      </w:r>
+      <w:proofErr w:type="spellStart"/>
+      <w:r>
+        <w:t>karte</w:t>
+      </w:r>
+      <w:proofErr w:type="spellEnd"/>
+      <w:r>
+        <w:t xml:space="preserve"> hain, </w:t>
+      </w:r>
+      <w:proofErr w:type="spellStart"/>
+      <w:r>
+        <w:t>jismein</w:t>
+      </w:r>
+      <w:proofErr w:type="spellEnd"/>
+      <w:r>
+        <w:t xml:space="preserve"> rows aur columns </w:t>
+      </w:r>
+      <w:proofErr w:type="spellStart"/>
+      <w:r>
+        <w:t>hote</w:t>
+      </w:r>
+      <w:proofErr w:type="spellEnd"/>
+      <w:r>
+        <w:t xml:space="preserve"> hain.</w:t>
+      </w:r>
+    </w:p>
+    <w:p>
+      <w:pPr>
+        <w:numPr>
+          <w:ilvl w:val="1"/>
+          <w:numId w:val="6"/>
+        </w:numPr>
+      </w:pPr>
+      <w:r>
+        <w:rPr>
+          <w:b/>
+          <w:bCs/>
+        </w:rPr>
+        <w:t>Logic:</w:t>
+      </w:r>
+      <w:r>
+        <w:t xml:space="preserve"> Tables </w:t>
+      </w:r>
+      <w:proofErr w:type="spellStart"/>
+      <w:r>
+        <w:t>ke</w:t>
+      </w:r>
+      <w:proofErr w:type="spellEnd"/>
+      <w:r>
+        <w:t xml:space="preserve"> beech </w:t>
+      </w:r>
+      <w:proofErr w:type="spellStart"/>
+      <w:r>
+        <w:t>mein</w:t>
+      </w:r>
+      <w:proofErr w:type="spellEnd"/>
+      <w:r>
+        <w:t xml:space="preserve"> "Relations" </w:t>
+      </w:r>
+      <w:proofErr w:type="spellStart"/>
+      <w:r>
+        <w:t>hote</w:t>
+      </w:r>
+      <w:proofErr w:type="spellEnd"/>
+      <w:r>
+        <w:t xml:space="preserve"> hain (</w:t>
+      </w:r>
+      <w:proofErr w:type="spellStart"/>
+      <w:r>
+        <w:t>jaise</w:t>
+      </w:r>
+      <w:proofErr w:type="spellEnd"/>
+      <w:r>
+        <w:t xml:space="preserve"> Student ID ko linking key use </w:t>
+      </w:r>
+      <w:proofErr w:type="spellStart"/>
+      <w:r>
+        <w:t>karna</w:t>
+      </w:r>
+      <w:proofErr w:type="spellEnd"/>
+      <w:r>
+        <w:t>).</w:t>
+      </w:r>
+    </w:p>
+    <w:p>
+      <w:pPr>
+        <w:numPr>
+          <w:ilvl w:val="1"/>
+          <w:numId w:val="6"/>
+        </w:numPr>
+      </w:pPr>
+      <w:r>
+        <w:rPr>
+          <w:b/>
+          <w:bCs/>
+        </w:rPr>
+        <w:t>Query Language:</w:t>
+      </w:r>
+      <w:r>
+        <w:t xml:space="preserve"> Isme hum data manage </w:t>
+      </w:r>
+      <w:proofErr w:type="spellStart"/>
+      <w:r>
+        <w:t>karne</w:t>
+      </w:r>
+      <w:proofErr w:type="spellEnd"/>
+      <w:r>
+        <w:t xml:space="preserve"> </w:t>
+      </w:r>
+      <w:proofErr w:type="spellStart"/>
+      <w:r>
+        <w:t>ke</w:t>
+      </w:r>
+      <w:proofErr w:type="spellEnd"/>
+      <w:r>
+        <w:t xml:space="preserve"> </w:t>
+      </w:r>
+      <w:proofErr w:type="spellStart"/>
+      <w:r>
+        <w:t>liye</w:t>
+      </w:r>
+      <w:proofErr w:type="spellEnd"/>
+      <w:r>
+        <w:t xml:space="preserve"> SQL (Structured Query Language) ka use </w:t>
+      </w:r>
+      <w:proofErr w:type="spellStart"/>
+      <w:r>
+        <w:t>karte</w:t>
+      </w:r>
+      <w:proofErr w:type="spellEnd"/>
+      <w:r>
+        <w:t xml:space="preserve"> hain.</w:t>
+      </w:r>
+    </w:p>
+    <w:p>
+      <w:pPr>
+        <w:numPr>
+          <w:ilvl w:val="1"/>
+          <w:numId w:val="6"/>
+        </w:numPr>
+      </w:pPr>
+      <w:r>
+        <w:rPr>
+          <w:b/>
+          <w:bCs/>
+        </w:rPr>
+        <w:t>Examples:</w:t>
+      </w:r>
+      <w:r>
+        <w:t xml:space="preserve"> MySQL, PostgreSQL, Oracle, Microsoft SQL Server.</w:t>
+      </w:r>
+    </w:p>
+    <w:p>
+      <w:pPr>
+        <w:numPr>
+          <w:ilvl w:val="0"/>
+          <w:numId w:val="6"/>
+        </w:numPr>
+      </w:pPr>
+      <w:r>
+        <w:rPr>
+          <w:b/>
+          <w:bCs/>
+        </w:rPr>
+        <w:t>NoSQL Database (Not Only SQL):</w:t>
+      </w:r>
+      <w:r>
+        <w:t xml:space="preserve"> Jab </w:t>
+      </w:r>
+      <w:proofErr w:type="spellStart"/>
+      <w:r>
+        <w:t>humein</w:t>
+      </w:r>
+      <w:proofErr w:type="spellEnd"/>
+      <w:r>
+        <w:t xml:space="preserve"> flexible data handle </w:t>
+      </w:r>
+      <w:proofErr w:type="spellStart"/>
+      <w:r>
+        <w:t>karna</w:t>
+      </w:r>
+      <w:proofErr w:type="spellEnd"/>
+      <w:r>
+        <w:t xml:space="preserve"> </w:t>
+      </w:r>
+      <w:proofErr w:type="spellStart"/>
+      <w:r>
+        <w:t>hota</w:t>
+      </w:r>
+      <w:proofErr w:type="spellEnd"/>
+      <w:r>
+        <w:t xml:space="preserve"> </w:t>
+      </w:r>
+      <w:proofErr w:type="spellStart"/>
+      <w:r>
+        <w:t>hai</w:t>
+      </w:r>
+      <w:proofErr w:type="spellEnd"/>
+      <w:r>
+        <w:t xml:space="preserve"> jo traditional table format </w:t>
+      </w:r>
+      <w:proofErr w:type="spellStart"/>
+      <w:r>
+        <w:t>mein</w:t>
+      </w:r>
+      <w:proofErr w:type="spellEnd"/>
+      <w:r>
+        <w:t xml:space="preserve"> fit </w:t>
+      </w:r>
+      <w:proofErr w:type="spellStart"/>
+      <w:r>
+        <w:t>nahi</w:t>
+      </w:r>
+      <w:proofErr w:type="spellEnd"/>
+      <w:r>
+        <w:t xml:space="preserve"> </w:t>
+      </w:r>
+      <w:proofErr w:type="spellStart"/>
+      <w:r>
+        <w:t>baithta</w:t>
+      </w:r>
+      <w:proofErr w:type="spellEnd"/>
+      <w:r>
+        <w:t xml:space="preserve">, tab NoSQL use </w:t>
+      </w:r>
+      <w:proofErr w:type="spellStart"/>
+      <w:r>
+        <w:t>karte</w:t>
+      </w:r>
+      <w:proofErr w:type="spellEnd"/>
+      <w:r>
+        <w:t xml:space="preserve"> hain.</w:t>
+      </w:r>
+    </w:p>
+    <w:p>
+      <w:pPr>
+        <w:numPr>
+          <w:ilvl w:val="1"/>
+          <w:numId w:val="6"/>
+        </w:numPr>
+      </w:pPr>
+      <w:r>
+        <w:rPr>
+          <w:b/>
+          <w:bCs/>
+        </w:rPr>
+        <w:t>Structure:</w:t>
+      </w:r>
+      <w:r>
+        <w:t xml:space="preserve"> Data "Key-Value Pairs" </w:t>
+      </w:r>
+      <w:proofErr w:type="spellStart"/>
+      <w:r>
+        <w:t>mein</w:t>
+      </w:r>
+      <w:proofErr w:type="spellEnd"/>
+      <w:r>
+        <w:t xml:space="preserve"> store </w:t>
+      </w:r>
+      <w:proofErr w:type="spellStart"/>
+      <w:r>
+        <w:t>hota</w:t>
+      </w:r>
+      <w:proofErr w:type="spellEnd"/>
+      <w:r>
+        <w:t xml:space="preserve"> </w:t>
+      </w:r>
+      <w:proofErr w:type="spellStart"/>
+      <w:r>
+        <w:t>hai</w:t>
+      </w:r>
+      <w:proofErr w:type="spellEnd"/>
+      <w:r>
+        <w:t xml:space="preserve"> (hashing </w:t>
+      </w:r>
+      <w:proofErr w:type="spellStart"/>
+      <w:r>
+        <w:t>jaisa</w:t>
+      </w:r>
+      <w:proofErr w:type="spellEnd"/>
+      <w:r>
+        <w:t>).</w:t>
+      </w:r>
+    </w:p>
+    <w:p>
+      <w:pPr>
+        <w:numPr>
+          <w:ilvl w:val="1"/>
+          <w:numId w:val="6"/>
+        </w:numPr>
+      </w:pPr>
+      <w:r>
+        <w:rPr>
+          <w:b/>
+          <w:bCs/>
+        </w:rPr>
+        <w:lastRenderedPageBreak/>
+        <w:t>Logic:</w:t>
+      </w:r>
+      <w:r>
+        <w:t xml:space="preserve"> Yahan koi strict relation </w:t>
+      </w:r>
+      <w:proofErr w:type="spellStart"/>
+      <w:r>
+        <w:t>ya</w:t>
+      </w:r>
+      <w:proofErr w:type="spellEnd"/>
+      <w:r>
+        <w:t xml:space="preserve"> schema (structure) </w:t>
+      </w:r>
+      <w:proofErr w:type="spellStart"/>
+      <w:r>
+        <w:t>nahi</w:t>
+      </w:r>
+      <w:proofErr w:type="spellEnd"/>
+      <w:r>
+        <w:t xml:space="preserve"> </w:t>
+      </w:r>
+      <w:proofErr w:type="spellStart"/>
+      <w:r>
+        <w:t>hota</w:t>
+      </w:r>
+      <w:proofErr w:type="spellEnd"/>
+      <w:r>
+        <w:t>.</w:t>
+      </w:r>
+    </w:p>
+    <w:p>
+      <w:pPr>
+        <w:numPr>
+          <w:ilvl w:val="1"/>
+          <w:numId w:val="6"/>
+        </w:numPr>
+      </w:pPr>
+      <w:r>
+        <w:rPr>
+          <w:b/>
+          <w:bCs/>
+        </w:rPr>
+        <w:t>Use case:</w:t>
+      </w:r>
+      <w:r>
+        <w:t xml:space="preserve"> Jab data unstructured </w:t>
+      </w:r>
+      <w:proofErr w:type="spellStart"/>
+      <w:r>
+        <w:t>ho</w:t>
+      </w:r>
+      <w:proofErr w:type="spellEnd"/>
+      <w:r>
+        <w:t xml:space="preserve"> aur bahut </w:t>
+      </w:r>
+      <w:proofErr w:type="spellStart"/>
+      <w:r>
+        <w:t>tezi</w:t>
+      </w:r>
+      <w:proofErr w:type="spellEnd"/>
+      <w:r>
+        <w:t xml:space="preserve"> se change </w:t>
+      </w:r>
+      <w:proofErr w:type="spellStart"/>
+      <w:r>
+        <w:t>ho</w:t>
+      </w:r>
+      <w:proofErr w:type="spellEnd"/>
+      <w:r>
+        <w:t xml:space="preserve"> </w:t>
+      </w:r>
+      <w:proofErr w:type="spellStart"/>
+      <w:r>
+        <w:t>raha</w:t>
+      </w:r>
+      <w:proofErr w:type="spellEnd"/>
+      <w:r>
+        <w:t xml:space="preserve"> ho.</w:t>
+      </w:r>
+    </w:p>
+    <w:p>
+      <w:pPr>
+        <w:numPr>
+          <w:ilvl w:val="0"/>
+          <w:numId w:val="6"/>
+        </w:numPr>
+      </w:pPr>
+      <w:r>
+        <w:rPr>
+          <w:b/>
+          <w:bCs/>
+        </w:rPr>
+        <w:t>Object-Oriented Database:</w:t>
+      </w:r>
+      <w:r>
+        <w:t xml:space="preserve"> Ye "Object-Oriented Programming" (OOPs) </w:t>
+      </w:r>
+      <w:proofErr w:type="spellStart"/>
+      <w:r>
+        <w:t>ke</w:t>
+      </w:r>
+      <w:proofErr w:type="spellEnd"/>
+      <w:r>
+        <w:t xml:space="preserve"> concepts par </w:t>
+      </w:r>
+      <w:proofErr w:type="spellStart"/>
+      <w:r>
+        <w:t>kaam</w:t>
+      </w:r>
+      <w:proofErr w:type="spellEnd"/>
+      <w:r>
+        <w:t xml:space="preserve"> </w:t>
+      </w:r>
+      <w:proofErr w:type="spellStart"/>
+      <w:r>
+        <w:t>karta</w:t>
+      </w:r>
+      <w:proofErr w:type="spellEnd"/>
+      <w:r>
+        <w:t xml:space="preserve"> </w:t>
+      </w:r>
+      <w:proofErr w:type="spellStart"/>
+      <w:r>
+        <w:t>hai</w:t>
+      </w:r>
+      <w:proofErr w:type="spellEnd"/>
+      <w:r>
+        <w:t>.</w:t>
+      </w:r>
+    </w:p>
+    <w:p>
+      <w:pPr>
+        <w:numPr>
+          <w:ilvl w:val="1"/>
+          <w:numId w:val="6"/>
+        </w:numPr>
+      </w:pPr>
+      <w:r>
+        <w:rPr>
+          <w:b/>
+          <w:bCs/>
+        </w:rPr>
+        <w:t>Structure:</w:t>
+      </w:r>
+      <w:r>
+        <w:t xml:space="preserve"> Data ko "Objects" aur "Classes" </w:t>
+      </w:r>
+      <w:proofErr w:type="spellStart"/>
+      <w:r>
+        <w:t>ke</w:t>
+      </w:r>
+      <w:proofErr w:type="spellEnd"/>
+      <w:r>
+        <w:t xml:space="preserve"> format </w:t>
+      </w:r>
+      <w:proofErr w:type="spellStart"/>
+      <w:r>
+        <w:t>mein</w:t>
+      </w:r>
+      <w:proofErr w:type="spellEnd"/>
+      <w:r>
+        <w:t xml:space="preserve"> store </w:t>
+      </w:r>
+      <w:proofErr w:type="spellStart"/>
+      <w:r>
+        <w:t>karte</w:t>
+      </w:r>
+      <w:proofErr w:type="spellEnd"/>
+      <w:r>
+        <w:t xml:space="preserve"> hain.</w:t>
+      </w:r>
+    </w:p>
+    <w:p>
+      <w:pPr>
+        <w:numPr>
+          <w:ilvl w:val="1"/>
+          <w:numId w:val="6"/>
+        </w:numPr>
+      </w:pPr>
+      <w:r>
+        <w:rPr>
+          <w:b/>
+          <w:bCs/>
+        </w:rPr>
+        <w:t>Use case:</w:t>
+      </w:r>
+      <w:r>
+        <w:t xml:space="preserve"> Jahan data ki complexity bahut </w:t>
+      </w:r>
+      <w:proofErr w:type="spellStart"/>
+      <w:r>
+        <w:t>zyada</w:t>
+      </w:r>
+      <w:proofErr w:type="spellEnd"/>
+      <w:r>
+        <w:t xml:space="preserve"> </w:t>
+      </w:r>
+      <w:proofErr w:type="spellStart"/>
+      <w:r>
+        <w:t>ho</w:t>
+      </w:r>
+      <w:proofErr w:type="spellEnd"/>
+      <w:r>
+        <w:t xml:space="preserve">, </w:t>
+      </w:r>
+      <w:proofErr w:type="spellStart"/>
+      <w:r>
+        <w:t>jaise</w:t>
+      </w:r>
+      <w:proofErr w:type="spellEnd"/>
+      <w:r>
+        <w:t xml:space="preserve"> scientific simulations </w:t>
+      </w:r>
+      <w:proofErr w:type="spellStart"/>
+      <w:r>
+        <w:t>ya</w:t>
+      </w:r>
+      <w:proofErr w:type="spellEnd"/>
+      <w:r>
+        <w:t xml:space="preserve"> multimedia software.</w:t>
+      </w:r>
+    </w:p>
+    <w:p>
+      <w:pPr>
+        <w:numPr>
+          <w:ilvl w:val="0"/>
+          <w:numId w:val="6"/>
+        </w:numPr>
+      </w:pPr>
+      <w:r>
+        <w:rPr>
+          <w:b/>
+          <w:bCs/>
+        </w:rPr>
+        <w:t>In-Memory Database:</w:t>
+      </w:r>
+      <w:r>
+        <w:t xml:space="preserve"> Naam se hi </w:t>
+      </w:r>
+      <w:proofErr w:type="spellStart"/>
+      <w:r>
+        <w:t>pata</w:t>
+      </w:r>
+      <w:proofErr w:type="spellEnd"/>
+      <w:r>
+        <w:t xml:space="preserve"> </w:t>
+      </w:r>
+      <w:proofErr w:type="spellStart"/>
+      <w:r>
+        <w:t>chalta</w:t>
+      </w:r>
+      <w:proofErr w:type="spellEnd"/>
+      <w:r>
+        <w:t xml:space="preserve"> </w:t>
+      </w:r>
+      <w:proofErr w:type="spellStart"/>
+      <w:r>
+        <w:t>hai</w:t>
+      </w:r>
+      <w:proofErr w:type="spellEnd"/>
+      <w:r>
+        <w:t xml:space="preserve">—data hard disk </w:t>
+      </w:r>
+      <w:proofErr w:type="spellStart"/>
+      <w:r>
+        <w:t>ke</w:t>
+      </w:r>
+      <w:proofErr w:type="spellEnd"/>
+      <w:r>
+        <w:t xml:space="preserve"> </w:t>
+      </w:r>
+      <w:proofErr w:type="spellStart"/>
+      <w:r>
+        <w:t>bajaye</w:t>
+      </w:r>
+      <w:proofErr w:type="spellEnd"/>
+      <w:r>
+        <w:t xml:space="preserve"> "Primary Memory" (RAM) </w:t>
+      </w:r>
+      <w:proofErr w:type="spellStart"/>
+      <w:r>
+        <w:t>mein</w:t>
+      </w:r>
+      <w:proofErr w:type="spellEnd"/>
+      <w:r>
+        <w:t xml:space="preserve"> store </w:t>
+      </w:r>
+      <w:proofErr w:type="spellStart"/>
+      <w:r>
+        <w:t>hota</w:t>
+      </w:r>
+      <w:proofErr w:type="spellEnd"/>
+      <w:r>
+        <w:t xml:space="preserve"> </w:t>
+      </w:r>
+      <w:proofErr w:type="spellStart"/>
+      <w:r>
+        <w:t>hai</w:t>
+      </w:r>
+      <w:proofErr w:type="spellEnd"/>
+      <w:r>
+        <w:t>.</w:t>
+      </w:r>
+    </w:p>
+    <w:p>
+      <w:pPr>
+        <w:numPr>
+          <w:ilvl w:val="1"/>
+          <w:numId w:val="6"/>
+        </w:numPr>
+      </w:pPr>
+      <w:r>
+        <w:rPr>
+          <w:b/>
+          <w:bCs/>
+        </w:rPr>
+        <w:t>Benefit:</w:t>
+      </w:r>
+      <w:r>
+        <w:t xml:space="preserve"> </w:t>
+      </w:r>
+      <w:proofErr w:type="spellStart"/>
+      <w:r>
+        <w:t>Kyunki</w:t>
+      </w:r>
+      <w:proofErr w:type="spellEnd"/>
+      <w:r>
+        <w:t xml:space="preserve"> RAM ki speed disk se bahut </w:t>
+      </w:r>
+      <w:proofErr w:type="spellStart"/>
+      <w:r>
+        <w:t>zyada</w:t>
+      </w:r>
+      <w:proofErr w:type="spellEnd"/>
+      <w:r>
+        <w:t xml:space="preserve"> </w:t>
+      </w:r>
+      <w:proofErr w:type="spellStart"/>
+      <w:r>
+        <w:t>hoti</w:t>
+      </w:r>
+      <w:proofErr w:type="spellEnd"/>
+      <w:r>
+        <w:t xml:space="preserve"> </w:t>
+      </w:r>
+      <w:proofErr w:type="spellStart"/>
+      <w:r>
+        <w:t>hai</w:t>
+      </w:r>
+      <w:proofErr w:type="spellEnd"/>
+      <w:r>
+        <w:t xml:space="preserve">, </w:t>
+      </w:r>
+      <w:proofErr w:type="spellStart"/>
+      <w:r>
+        <w:t>isliye</w:t>
+      </w:r>
+      <w:proofErr w:type="spellEnd"/>
+      <w:r>
+        <w:t xml:space="preserve"> data retrieve </w:t>
+      </w:r>
+      <w:proofErr w:type="spellStart"/>
+      <w:r>
+        <w:t>karna</w:t>
+      </w:r>
+      <w:proofErr w:type="spellEnd"/>
+      <w:r>
+        <w:t xml:space="preserve"> bahut fast </w:t>
+      </w:r>
+      <w:proofErr w:type="spellStart"/>
+      <w:r>
+        <w:t>ho</w:t>
+      </w:r>
+      <w:proofErr w:type="spellEnd"/>
+      <w:r>
+        <w:t xml:space="preserve"> </w:t>
+      </w:r>
+      <w:proofErr w:type="spellStart"/>
+      <w:r>
+        <w:t>jaata</w:t>
+      </w:r>
+      <w:proofErr w:type="spellEnd"/>
+      <w:r>
+        <w:t xml:space="preserve"> </w:t>
+      </w:r>
+      <w:proofErr w:type="spellStart"/>
+      <w:r>
+        <w:t>hai</w:t>
+      </w:r>
+      <w:proofErr w:type="spellEnd"/>
+      <w:r>
+        <w:t>.</w:t>
+      </w:r>
+    </w:p>
+    <w:p>
+      <w:pPr>
+        <w:numPr>
+          <w:ilvl w:val="1"/>
+          <w:numId w:val="6"/>
+        </w:numPr>
+      </w:pPr>
+      <w:r>
+        <w:rPr>
+          <w:b/>
+          <w:bCs/>
+        </w:rPr>
+        <w:t>Use case:</w:t>
+      </w:r>
+      <w:r>
+        <w:t xml:space="preserve"> Jahan real-time, instant processing ki </w:t>
+      </w:r>
+      <w:proofErr w:type="spellStart"/>
+      <w:r>
+        <w:t>zaroorat</w:t>
+      </w:r>
+      <w:proofErr w:type="spellEnd"/>
+      <w:r>
+        <w:t xml:space="preserve"> ho.</w:t>
+      </w:r>
+    </w:p>
+    <w:p>
+      <w:pPr>
+        <w:numPr>
+          <w:ilvl w:val="0"/>
+          <w:numId w:val="6"/>
+        </w:numPr>
+      </w:pPr>
+      <w:r>
+        <w:rPr>
+          <w:b/>
+          <w:bCs/>
+        </w:rPr>
+        <w:t>Kuch aur types (Just for knowledge):</w:t>
+      </w:r>
+    </w:p>
+    <w:p>
+      <w:pPr>
+        <w:numPr>
+          <w:ilvl w:val="1"/>
+          <w:numId w:val="6"/>
+        </w:numPr>
+      </w:pPr>
+      <w:r>
+        <w:rPr>
+          <w:b/>
+          <w:bCs/>
+        </w:rPr>
+        <w:t>Time Series Database:</w:t>
+      </w:r>
+      <w:r>
+        <w:t xml:space="preserve"> Events ko time-based intervals </w:t>
+      </w:r>
+      <w:proofErr w:type="spellStart"/>
+      <w:r>
+        <w:t>ke</w:t>
+      </w:r>
+      <w:proofErr w:type="spellEnd"/>
+      <w:r>
+        <w:t xml:space="preserve"> </w:t>
+      </w:r>
+      <w:proofErr w:type="spellStart"/>
+      <w:r>
+        <w:t>saath</w:t>
+      </w:r>
+      <w:proofErr w:type="spellEnd"/>
+      <w:r>
+        <w:t xml:space="preserve"> store </w:t>
+      </w:r>
+      <w:proofErr w:type="spellStart"/>
+      <w:r>
+        <w:t>karta</w:t>
+      </w:r>
+      <w:proofErr w:type="spellEnd"/>
+      <w:r>
+        <w:t xml:space="preserve"> </w:t>
+      </w:r>
+      <w:proofErr w:type="spellStart"/>
+      <w:r>
+        <w:t>hai</w:t>
+      </w:r>
+      <w:proofErr w:type="spellEnd"/>
+      <w:r>
+        <w:t>.</w:t>
+      </w:r>
+    </w:p>
+    <w:p>
+      <w:pPr>
+        <w:numPr>
+          <w:ilvl w:val="1"/>
+          <w:numId w:val="6"/>
+        </w:numPr>
+      </w:pPr>
+      <w:r>
+        <w:rPr>
+          <w:b/>
+          <w:bCs/>
+        </w:rPr>
+        <w:t>Spatial Database:</w:t>
+      </w:r>
+      <w:r>
+        <w:t xml:space="preserve"> Geometric </w:t>
+      </w:r>
+      <w:proofErr w:type="spellStart"/>
+      <w:r>
+        <w:t>ya</w:t>
+      </w:r>
+      <w:proofErr w:type="spellEnd"/>
+      <w:r>
+        <w:t xml:space="preserve"> space-related data (</w:t>
+      </w:r>
+      <w:proofErr w:type="spellStart"/>
+      <w:r>
+        <w:t>jaise</w:t>
+      </w:r>
+      <w:proofErr w:type="spellEnd"/>
+      <w:r>
+        <w:t xml:space="preserve"> maps/location) store </w:t>
+      </w:r>
+      <w:proofErr w:type="spellStart"/>
+      <w:r>
+        <w:t>karta</w:t>
+      </w:r>
+      <w:proofErr w:type="spellEnd"/>
+      <w:r>
+        <w:t xml:space="preserve"> </w:t>
+      </w:r>
+      <w:proofErr w:type="spellStart"/>
+      <w:r>
+        <w:t>hai</w:t>
+      </w:r>
+      <w:proofErr w:type="spellEnd"/>
+      <w:r>
+        <w:t>.</w:t>
+      </w:r>
+    </w:p>
+    <w:p>
+      <w:pPr>
+        <w:numPr>
+          <w:ilvl w:val="1"/>
+          <w:numId w:val="6"/>
+        </w:numPr>
+      </w:pPr>
+      <w:r>
+        <w:rPr>
+          <w:b/>
+          <w:bCs/>
+        </w:rPr>
+        <w:t>Multimedia Database:</w:t>
+      </w:r>
+      <w:r>
+        <w:t xml:space="preserve"> Images, audio, video aur graphics store </w:t>
+      </w:r>
+      <w:proofErr w:type="spellStart"/>
+      <w:r>
+        <w:t>karne</w:t>
+      </w:r>
+      <w:proofErr w:type="spellEnd"/>
+      <w:r>
+        <w:t xml:space="preserve"> </w:t>
+      </w:r>
+      <w:proofErr w:type="spellStart"/>
+      <w:r>
+        <w:t>ke</w:t>
+      </w:r>
+      <w:proofErr w:type="spellEnd"/>
+      <w:r>
+        <w:t xml:space="preserve"> </w:t>
+      </w:r>
+      <w:proofErr w:type="spellStart"/>
+      <w:r>
+        <w:t>liye</w:t>
+      </w:r>
+      <w:proofErr w:type="spellEnd"/>
+      <w:r>
+        <w:t>.</w:t>
+      </w:r>
+    </w:p>
+    <w:p>
+      <w:pPr>
+        <w:numPr>
+          <w:ilvl w:val="1"/>
+          <w:numId w:val="6"/>
+        </w:numPr>
+      </w:pPr>
+      <w:r>
+        <w:rPr>
+          <w:b/>
+          <w:bCs/>
+        </w:rPr>
+        <w:t>Blockchain Database:</w:t>
+      </w:r>
+      <w:r>
+        <w:t xml:space="preserve"> Data ko "Blocks" ki chain </w:t>
+      </w:r>
+      <w:proofErr w:type="spellStart"/>
+      <w:r>
+        <w:t>mein</w:t>
+      </w:r>
+      <w:proofErr w:type="spellEnd"/>
+      <w:r>
+        <w:t xml:space="preserve"> decentralised </w:t>
+      </w:r>
+      <w:proofErr w:type="spellStart"/>
+      <w:r>
+        <w:t>tareeke</w:t>
+      </w:r>
+      <w:proofErr w:type="spellEnd"/>
+      <w:r>
+        <w:t xml:space="preserve"> se store </w:t>
+      </w:r>
+      <w:proofErr w:type="spellStart"/>
+      <w:r>
+        <w:t>karta</w:t>
+      </w:r>
+      <w:proofErr w:type="spellEnd"/>
+      <w:r>
+        <w:t xml:space="preserve"> </w:t>
+      </w:r>
+      <w:proofErr w:type="spellStart"/>
+      <w:r>
+        <w:t>hai</w:t>
+      </w:r>
+      <w:proofErr w:type="spellEnd"/>
+      <w:r>
+        <w:t>.</w:t>
+      </w:r>
+    </w:p>
+    <w:p>
+      <w:pPr>
+        <w:rPr>
+          <w:b/>
+          <w:bCs/>
+        </w:rPr>
+      </w:pPr>
+      <w:r>
+        <w:rPr>
+          <w:b/>
+          <w:bCs/>
+        </w:rPr>
+        <w:t>Key takeaway for your notes:</w:t>
+      </w:r>
+    </w:p>
+    <w:p>
+      <w:r>
+        <w:t xml:space="preserve">"Sare databases ka goal ek hi </w:t>
+      </w:r>
+      <w:proofErr w:type="spellStart"/>
+      <w:r>
+        <w:t>hai</w:t>
+      </w:r>
+      <w:proofErr w:type="spellEnd"/>
+      <w:r>
+        <w:t xml:space="preserve">—data handle </w:t>
+      </w:r>
+      <w:proofErr w:type="spellStart"/>
+      <w:r>
+        <w:t>karna</w:t>
+      </w:r>
+      <w:proofErr w:type="spellEnd"/>
+      <w:r>
+        <w:t>—</w:t>
+      </w:r>
+      <w:proofErr w:type="spellStart"/>
+      <w:r>
+        <w:t>lekin</w:t>
+      </w:r>
+      <w:proofErr w:type="spellEnd"/>
+      <w:r>
+        <w:t xml:space="preserve"> </w:t>
+      </w:r>
+      <w:proofErr w:type="spellStart"/>
+      <w:r>
+        <w:t>har</w:t>
+      </w:r>
+      <w:proofErr w:type="spellEnd"/>
+      <w:r>
+        <w:t xml:space="preserve"> database </w:t>
+      </w:r>
+      <w:proofErr w:type="spellStart"/>
+      <w:r>
+        <w:t>alag</w:t>
+      </w:r>
+      <w:proofErr w:type="spellEnd"/>
+      <w:r>
+        <w:t xml:space="preserve"> 'structure' (table, key-value, object) aur 'environment' (RAM, Disk) </w:t>
+      </w:r>
+      <w:proofErr w:type="spellStart"/>
+      <w:r>
+        <w:t>ke</w:t>
+      </w:r>
+      <w:proofErr w:type="spellEnd"/>
+      <w:r>
+        <w:t xml:space="preserve"> </w:t>
+      </w:r>
+      <w:proofErr w:type="spellStart"/>
+      <w:r>
+        <w:t>hisaab</w:t>
+      </w:r>
+      <w:proofErr w:type="spellEnd"/>
+      <w:r>
+        <w:t xml:space="preserve"> se design </w:t>
+      </w:r>
+      <w:proofErr w:type="spellStart"/>
+      <w:r>
+        <w:t>kiya</w:t>
+      </w:r>
+      <w:proofErr w:type="spellEnd"/>
+      <w:r>
+        <w:t xml:space="preserve"> </w:t>
+      </w:r>
+      <w:proofErr w:type="spellStart"/>
+      <w:r>
+        <w:t>gaya</w:t>
+      </w:r>
+      <w:proofErr w:type="spellEnd"/>
+      <w:r>
+        <w:t xml:space="preserve"> </w:t>
+      </w:r>
+      <w:proofErr w:type="spellStart"/>
+      <w:r>
+        <w:t>hai</w:t>
+      </w:r>
+      <w:proofErr w:type="spellEnd"/>
+      <w:r>
+        <w:t xml:space="preserve">. Projects </w:t>
+      </w:r>
+      <w:proofErr w:type="spellStart"/>
+      <w:r>
+        <w:t>banate</w:t>
+      </w:r>
+      <w:proofErr w:type="spellEnd"/>
+      <w:r>
+        <w:t xml:space="preserve"> </w:t>
+      </w:r>
+      <w:proofErr w:type="spellStart"/>
+      <w:r>
+        <w:t>waqt</w:t>
+      </w:r>
+      <w:proofErr w:type="spellEnd"/>
+      <w:r>
+        <w:t xml:space="preserve">, selection of database is based on the </w:t>
+      </w:r>
+      <w:r>
+        <w:rPr>
+          <w:b/>
+          <w:bCs/>
+        </w:rPr>
+        <w:t>nature of your data</w:t>
+      </w:r>
+      <w:r>
+        <w:t>."</w:t>
+      </w:r>
+    </w:p>
+    <w:p>
+      <w:r>
+        <w:pict w14:anchorId="37A97FE6">
+          <v:rect id="_x0000_i1041" style="width:0;height:1.5pt" o:hralign="center" o:bullet="t" o:hrstd="t" o:hr="t" fillcolor="#a0a0a0" stroked="f"/>
+        </w:pict>
+      </w:r>
+    </w:p>
+    <w:p>
+      <w:pPr>
+        <w:rPr>
+          <w:b/>
+          <w:bCs/>
+          <w:sz w:val="28"/>
+          <w:szCs w:val="28"/>
+          <w:u w:val="single"/>
+        </w:rPr>
+      </w:pPr>
+      <w:r>
+        <w:rPr>
+          <w:b/>
+          <w:bCs/>
+          <w:sz w:val="40"/>
+          <w:szCs w:val="40"/>
+          <w:u w:val="single"/>
+        </w:rPr>
+        <w:t xml:space="preserve">DBMS NOTES (PART </w:t>
+      </w:r>
+      <w:r>
+        <w:rPr>
+          <w:b/>
+          <w:bCs/>
+          <w:sz w:val="40"/>
+          <w:szCs w:val="40"/>
+          <w:u w:val="single"/>
+        </w:rPr>
+        <w:t>3</w:t>
+      </w:r>
+      <w:r>
+        <w:rPr>
+          <w:b/>
+          <w:bCs/>
+          <w:sz w:val="40"/>
+          <w:szCs w:val="40"/>
+          <w:u w:val="single"/>
+        </w:rPr>
+        <w:t>)</w:t>
+      </w:r>
+    </w:p>
+    <w:p>
+      <w:pPr>
+        <w:rPr>
+          <w:b/>
+          <w:bCs/>
+        </w:rPr>
+      </w:pPr>
+      <w:r>
+        <w:rPr>
+          <w:b/>
+          <w:bCs/>
+        </w:rPr>
+        <w:t>1. Need for DBMS</w:t>
+      </w:r>
+    </w:p>
+    <w:p>
+      <w:r>
+        <w:t xml:space="preserve">DBMS </w:t>
+      </w:r>
+      <w:proofErr w:type="spellStart"/>
+      <w:r>
+        <w:t>aajkal</w:t>
+      </w:r>
+      <w:proofErr w:type="spellEnd"/>
+      <w:r>
+        <w:t xml:space="preserve"> </w:t>
+      </w:r>
+      <w:proofErr w:type="spellStart"/>
+      <w:r>
+        <w:t>har</w:t>
+      </w:r>
+      <w:proofErr w:type="spellEnd"/>
+      <w:r>
+        <w:t xml:space="preserve"> </w:t>
+      </w:r>
+      <w:proofErr w:type="spellStart"/>
+      <w:r>
+        <w:t>jagah</w:t>
+      </w:r>
+      <w:proofErr w:type="spellEnd"/>
+      <w:r>
+        <w:t xml:space="preserve"> </w:t>
+      </w:r>
+      <w:proofErr w:type="spellStart"/>
+      <w:r>
+        <w:t>hai</w:t>
+      </w:r>
+      <w:proofErr w:type="spellEnd"/>
+      <w:r>
+        <w:t xml:space="preserve">—schools, banks, hospitals, aur </w:t>
+      </w:r>
+      <w:proofErr w:type="spellStart"/>
+      <w:r>
+        <w:t>tumhare</w:t>
+      </w:r>
+      <w:proofErr w:type="spellEnd"/>
+      <w:r>
+        <w:t xml:space="preserve"> </w:t>
+      </w:r>
+      <w:proofErr w:type="spellStart"/>
+      <w:r>
+        <w:t>jaise</w:t>
+      </w:r>
+      <w:proofErr w:type="spellEnd"/>
+      <w:r>
+        <w:t xml:space="preserve"> software developers </w:t>
+      </w:r>
+      <w:proofErr w:type="spellStart"/>
+      <w:r>
+        <w:t>ke</w:t>
+      </w:r>
+      <w:proofErr w:type="spellEnd"/>
+      <w:r>
+        <w:t xml:space="preserve"> projects </w:t>
+      </w:r>
+      <w:proofErr w:type="spellStart"/>
+      <w:r>
+        <w:t>mein</w:t>
+      </w:r>
+      <w:proofErr w:type="spellEnd"/>
+      <w:r>
+        <w:t xml:space="preserve">. Iski </w:t>
+      </w:r>
+      <w:proofErr w:type="spellStart"/>
+      <w:r>
+        <w:t>zaroorat</w:t>
+      </w:r>
+      <w:proofErr w:type="spellEnd"/>
+      <w:r>
+        <w:t xml:space="preserve"> </w:t>
+      </w:r>
+      <w:proofErr w:type="spellStart"/>
+      <w:r>
+        <w:t>kyun</w:t>
+      </w:r>
+      <w:proofErr w:type="spellEnd"/>
+      <w:r>
+        <w:t xml:space="preserve"> </w:t>
+      </w:r>
+      <w:proofErr w:type="spellStart"/>
+      <w:r>
+        <w:t>hai</w:t>
+      </w:r>
+      <w:proofErr w:type="spellEnd"/>
+      <w:r>
+        <w:t>?</w:t>
+      </w:r>
+    </w:p>
+    <w:p>
+      <w:pPr>
+        <w:numPr>
+          <w:ilvl w:val="0"/>
+          <w:numId w:val="7"/>
+        </w:numPr>
+      </w:pPr>
+      <w:r>
+        <w:rPr>
+          <w:b/>
+          <w:bCs/>
+        </w:rPr>
+        <w:t>Easy Manipulation:</w:t>
+      </w:r>
+      <w:r>
+        <w:t xml:space="preserve"> Data ko insert, update, delete, </w:t>
+      </w:r>
+      <w:proofErr w:type="spellStart"/>
+      <w:r>
+        <w:t>ya</w:t>
+      </w:r>
+      <w:proofErr w:type="spellEnd"/>
+      <w:r>
+        <w:t xml:space="preserve"> </w:t>
+      </w:r>
+      <w:proofErr w:type="spellStart"/>
+      <w:r>
+        <w:t>usme</w:t>
+      </w:r>
+      <w:proofErr w:type="spellEnd"/>
+      <w:r>
+        <w:t xml:space="preserve"> calculation </w:t>
+      </w:r>
+      <w:proofErr w:type="spellStart"/>
+      <w:r>
+        <w:t>karne</w:t>
+      </w:r>
+      <w:proofErr w:type="spellEnd"/>
+      <w:r>
+        <w:t xml:space="preserve"> </w:t>
+      </w:r>
+      <w:proofErr w:type="spellStart"/>
+      <w:r>
+        <w:t>ke</w:t>
+      </w:r>
+      <w:proofErr w:type="spellEnd"/>
+      <w:r>
+        <w:t xml:space="preserve"> </w:t>
+      </w:r>
+      <w:proofErr w:type="spellStart"/>
+      <w:r>
+        <w:t>liye</w:t>
+      </w:r>
+      <w:proofErr w:type="spellEnd"/>
+      <w:r>
+        <w:t xml:space="preserve"> DBMS ek </w:t>
+      </w:r>
+      <w:proofErr w:type="spellStart"/>
+      <w:r>
+        <w:t>bohot</w:t>
+      </w:r>
+      <w:proofErr w:type="spellEnd"/>
+      <w:r>
+        <w:t xml:space="preserve"> smooth interface </w:t>
+      </w:r>
+      <w:proofErr w:type="spellStart"/>
+      <w:r>
+        <w:t>deta</w:t>
+      </w:r>
+      <w:proofErr w:type="spellEnd"/>
+      <w:r>
+        <w:t xml:space="preserve"> </w:t>
+      </w:r>
+      <w:proofErr w:type="spellStart"/>
+      <w:r>
+        <w:t>hai</w:t>
+      </w:r>
+      <w:proofErr w:type="spellEnd"/>
+      <w:r>
+        <w:t>.</w:t>
+      </w:r>
+    </w:p>
+    <w:p>
+      <w:pPr>
+        <w:numPr>
+          <w:ilvl w:val="0"/>
+          <w:numId w:val="7"/>
+        </w:numPr>
+      </w:pPr>
+      <w:r>
+        <w:rPr>
+          <w:b/>
+          <w:bCs/>
+        </w:rPr>
+        <w:lastRenderedPageBreak/>
+        <w:t>Security:</w:t>
+      </w:r>
+      <w:r>
+        <w:t xml:space="preserve"> Data ko </w:t>
+      </w:r>
+      <w:proofErr w:type="spellStart"/>
+      <w:r>
+        <w:t>unauthroized</w:t>
+      </w:r>
+      <w:proofErr w:type="spellEnd"/>
+      <w:r>
+        <w:t xml:space="preserve"> logon se </w:t>
+      </w:r>
+      <w:proofErr w:type="spellStart"/>
+      <w:r>
+        <w:t>bachane</w:t>
+      </w:r>
+      <w:proofErr w:type="spellEnd"/>
+      <w:r>
+        <w:t xml:space="preserve"> </w:t>
+      </w:r>
+      <w:proofErr w:type="spellStart"/>
+      <w:r>
+        <w:t>ke</w:t>
+      </w:r>
+      <w:proofErr w:type="spellEnd"/>
+      <w:r>
+        <w:t xml:space="preserve"> </w:t>
+      </w:r>
+      <w:proofErr w:type="spellStart"/>
+      <w:r>
+        <w:t>liye</w:t>
+      </w:r>
+      <w:proofErr w:type="spellEnd"/>
+      <w:r>
+        <w:t xml:space="preserve"> "Access Control" aur "Authentication" rules </w:t>
+      </w:r>
+      <w:proofErr w:type="spellStart"/>
+      <w:r>
+        <w:t>hote</w:t>
+      </w:r>
+      <w:proofErr w:type="spellEnd"/>
+      <w:r>
+        <w:t xml:space="preserve"> hain.</w:t>
+      </w:r>
+    </w:p>
+    <w:p>
+      <w:pPr>
+        <w:numPr>
+          <w:ilvl w:val="0"/>
+          <w:numId w:val="7"/>
+        </w:numPr>
+      </w:pPr>
+      <w:r>
+        <w:rPr>
+          <w:b/>
+          <w:bCs/>
+        </w:rPr>
+        <w:t>Efficient Management:</w:t>
+      </w:r>
+      <w:r>
+        <w:t xml:space="preserve"> Ye modern information systems ka core </w:t>
+      </w:r>
+      <w:proofErr w:type="spellStart"/>
+      <w:r>
+        <w:t>hai</w:t>
+      </w:r>
+      <w:proofErr w:type="spellEnd"/>
+      <w:r>
+        <w:t>, jo scalability (</w:t>
+      </w:r>
+      <w:proofErr w:type="spellStart"/>
+      <w:r>
+        <w:t>badhte</w:t>
+      </w:r>
+      <w:proofErr w:type="spellEnd"/>
+      <w:r>
+        <w:t xml:space="preserve"> hue data ko handle </w:t>
+      </w:r>
+      <w:proofErr w:type="spellStart"/>
+      <w:r>
+        <w:t>karna</w:t>
+      </w:r>
+      <w:proofErr w:type="spellEnd"/>
+      <w:r>
+        <w:t xml:space="preserve">) aur accuracy provide </w:t>
+      </w:r>
+      <w:proofErr w:type="spellStart"/>
+      <w:r>
+        <w:t>karta</w:t>
+      </w:r>
+      <w:proofErr w:type="spellEnd"/>
+      <w:r>
+        <w:t xml:space="preserve"> </w:t>
+      </w:r>
+      <w:proofErr w:type="spellStart"/>
+      <w:r>
+        <w:t>hai</w:t>
+      </w:r>
+      <w:proofErr w:type="spellEnd"/>
+      <w:r>
+        <w:t>.</w:t>
+      </w:r>
+    </w:p>
+    <w:p>
+      <w:pPr>
+        <w:rPr>
+          <w:b/>
+          <w:bCs/>
+        </w:rPr>
+      </w:pPr>
+      <w:r>
+        <w:rPr>
+          <w:b/>
+          <w:bCs/>
+        </w:rPr>
+        <w:t>2. Advantages of DBMS (Pros)</w:t>
+      </w:r>
+    </w:p>
+    <w:p>
+      <w:pPr>
+        <w:numPr>
+          <w:ilvl w:val="0"/>
+          <w:numId w:val="8"/>
+        </w:numPr>
+      </w:pPr>
+      <w:r>
+        <w:rPr>
+          <w:b/>
+          <w:bCs/>
+        </w:rPr>
+        <w:t>Data Security:</w:t>
+      </w:r>
+      <w:r>
+        <w:t xml:space="preserve"> Sensitive info (</w:t>
+      </w:r>
+      <w:proofErr w:type="spellStart"/>
+      <w:r>
+        <w:t>jaise</w:t>
+      </w:r>
+      <w:proofErr w:type="spellEnd"/>
+      <w:r>
+        <w:t xml:space="preserve"> </w:t>
+      </w:r>
+      <w:proofErr w:type="spellStart"/>
+      <w:r>
+        <w:t>tumhara</w:t>
+      </w:r>
+      <w:proofErr w:type="spellEnd"/>
+      <w:r>
+        <w:t xml:space="preserve"> phone number </w:t>
+      </w:r>
+      <w:proofErr w:type="spellStart"/>
+      <w:r>
+        <w:t>ya</w:t>
+      </w:r>
+      <w:proofErr w:type="spellEnd"/>
+      <w:r>
+        <w:t xml:space="preserve"> email) protected </w:t>
+      </w:r>
+      <w:proofErr w:type="spellStart"/>
+      <w:r>
+        <w:t>rehti</w:t>
+      </w:r>
+      <w:proofErr w:type="spellEnd"/>
+      <w:r>
+        <w:t xml:space="preserve"> </w:t>
+      </w:r>
+      <w:proofErr w:type="spellStart"/>
+      <w:r>
+        <w:t>hai</w:t>
+      </w:r>
+      <w:proofErr w:type="spellEnd"/>
+      <w:r>
+        <w:t xml:space="preserve">. </w:t>
+      </w:r>
+      <w:proofErr w:type="spellStart"/>
+      <w:r>
+        <w:t>Sirf</w:t>
+      </w:r>
+      <w:proofErr w:type="spellEnd"/>
+      <w:r>
+        <w:t xml:space="preserve"> </w:t>
+      </w:r>
+      <w:proofErr w:type="spellStart"/>
+      <w:r>
+        <w:t>sahi</w:t>
+      </w:r>
+      <w:proofErr w:type="spellEnd"/>
+      <w:r>
+        <w:t xml:space="preserve"> credentials wale log hi data access </w:t>
+      </w:r>
+      <w:proofErr w:type="spellStart"/>
+      <w:r>
+        <w:t>kar</w:t>
+      </w:r>
+      <w:proofErr w:type="spellEnd"/>
+      <w:r>
+        <w:t xml:space="preserve"> </w:t>
+      </w:r>
+      <w:proofErr w:type="spellStart"/>
+      <w:r>
+        <w:t>sakte</w:t>
+      </w:r>
+      <w:proofErr w:type="spellEnd"/>
+      <w:r>
+        <w:t xml:space="preserve"> hain.</w:t>
+      </w:r>
+    </w:p>
+    <w:p>
+      <w:pPr>
+        <w:numPr>
+          <w:ilvl w:val="0"/>
+          <w:numId w:val="8"/>
+        </w:numPr>
+      </w:pPr>
+      <w:r>
+        <w:rPr>
+          <w:b/>
+          <w:bCs/>
+        </w:rPr>
+        <w:t>Redundancy &amp; Inconsistency Control:</w:t>
+      </w:r>
+      <w:r>
+        <w:t xml:space="preserve"> Data ko centralised location pe </w:t>
+      </w:r>
+      <w:proofErr w:type="spellStart"/>
+      <w:r>
+        <w:t>rakha</w:t>
+      </w:r>
+      <w:proofErr w:type="spellEnd"/>
+      <w:r>
+        <w:t xml:space="preserve"> </w:t>
+      </w:r>
+      <w:proofErr w:type="spellStart"/>
+      <w:r>
+        <w:t>jaata</w:t>
+      </w:r>
+      <w:proofErr w:type="spellEnd"/>
+      <w:r>
+        <w:t xml:space="preserve"> </w:t>
+      </w:r>
+      <w:proofErr w:type="spellStart"/>
+      <w:r>
+        <w:t>hai</w:t>
+      </w:r>
+      <w:proofErr w:type="spellEnd"/>
+      <w:r>
+        <w:t xml:space="preserve">. Isse duplication khatam </w:t>
+      </w:r>
+      <w:proofErr w:type="spellStart"/>
+      <w:r>
+        <w:t>hoti</w:t>
+      </w:r>
+      <w:proofErr w:type="spellEnd"/>
+      <w:r>
+        <w:t xml:space="preserve"> </w:t>
+      </w:r>
+      <w:proofErr w:type="spellStart"/>
+      <w:r>
+        <w:t>hai</w:t>
+      </w:r>
+      <w:proofErr w:type="spellEnd"/>
+      <w:r>
+        <w:t xml:space="preserve"> aur "Single Version of Truth" maintain </w:t>
+      </w:r>
+      <w:proofErr w:type="spellStart"/>
+      <w:r>
+        <w:t>rehta</w:t>
+      </w:r>
+      <w:proofErr w:type="spellEnd"/>
+      <w:r>
+        <w:t xml:space="preserve"> </w:t>
+      </w:r>
+      <w:proofErr w:type="spellStart"/>
+      <w:r>
+        <w:t>hai</w:t>
+      </w:r>
+      <w:proofErr w:type="spellEnd"/>
+      <w:r>
+        <w:t xml:space="preserve"> (agar data update </w:t>
+      </w:r>
+      <w:proofErr w:type="spellStart"/>
+      <w:r>
+        <w:t>hua</w:t>
+      </w:r>
+      <w:proofErr w:type="spellEnd"/>
+      <w:r>
+        <w:t xml:space="preserve">, </w:t>
+      </w:r>
+      <w:proofErr w:type="spellStart"/>
+      <w:r>
+        <w:t>toh</w:t>
+      </w:r>
+      <w:proofErr w:type="spellEnd"/>
+      <w:r>
+        <w:t xml:space="preserve"> sab </w:t>
+      </w:r>
+      <w:proofErr w:type="spellStart"/>
+      <w:r>
+        <w:t>jagah</w:t>
+      </w:r>
+      <w:proofErr w:type="spellEnd"/>
+      <w:r>
+        <w:t xml:space="preserve"> same update </w:t>
+      </w:r>
+      <w:proofErr w:type="spellStart"/>
+      <w:r>
+        <w:t>hoga</w:t>
+      </w:r>
+      <w:proofErr w:type="spellEnd"/>
+      <w:r>
+        <w:t>).</w:t>
+      </w:r>
+    </w:p>
+    <w:p>
+      <w:pPr>
+        <w:numPr>
+          <w:ilvl w:val="0"/>
+          <w:numId w:val="8"/>
+        </w:numPr>
+      </w:pPr>
+      <w:r>
+        <w:rPr>
+          <w:b/>
+          <w:bCs/>
+        </w:rPr>
+        <w:t>Data Integrity:</w:t>
+      </w:r>
+      <w:r>
+        <w:t xml:space="preserve"> Hum rules (Constraints) set </w:t>
+      </w:r>
+      <w:proofErr w:type="spellStart"/>
+      <w:r>
+        <w:t>kar</w:t>
+      </w:r>
+      <w:proofErr w:type="spellEnd"/>
+      <w:r>
+        <w:t xml:space="preserve"> </w:t>
+      </w:r>
+      <w:proofErr w:type="spellStart"/>
+      <w:r>
+        <w:t>sakte</w:t>
+      </w:r>
+      <w:proofErr w:type="spellEnd"/>
+      <w:r>
+        <w:t xml:space="preserve"> hain. Jaise "Age" </w:t>
+      </w:r>
+      <w:proofErr w:type="spellStart"/>
+      <w:r>
+        <w:t>ke</w:t>
+      </w:r>
+      <w:proofErr w:type="spellEnd"/>
+      <w:r>
+        <w:t xml:space="preserve"> column </w:t>
+      </w:r>
+      <w:proofErr w:type="spellStart"/>
+      <w:r>
+        <w:t>mein</w:t>
+      </w:r>
+      <w:proofErr w:type="spellEnd"/>
+      <w:r>
+        <w:t xml:space="preserve"> </w:t>
+      </w:r>
+      <w:proofErr w:type="spellStart"/>
+      <w:r>
+        <w:t>sirf</w:t>
+      </w:r>
+      <w:proofErr w:type="spellEnd"/>
+      <w:r>
+        <w:t xml:space="preserve"> integer hi </w:t>
+      </w:r>
+      <w:proofErr w:type="spellStart"/>
+      <w:r>
+        <w:t>aayega</w:t>
+      </w:r>
+      <w:proofErr w:type="spellEnd"/>
+      <w:r>
+        <w:t xml:space="preserve">, koi alphabet (ABC) </w:t>
+      </w:r>
+      <w:proofErr w:type="spellStart"/>
+      <w:r>
+        <w:t>nahi</w:t>
+      </w:r>
+      <w:proofErr w:type="spellEnd"/>
+      <w:r>
+        <w:t xml:space="preserve">. Ye </w:t>
+      </w:r>
+      <w:proofErr w:type="spellStart"/>
+      <w:r>
+        <w:t>galat</w:t>
+      </w:r>
+      <w:proofErr w:type="spellEnd"/>
+      <w:r>
+        <w:t xml:space="preserve"> data enter hone se </w:t>
+      </w:r>
+      <w:proofErr w:type="spellStart"/>
+      <w:r>
+        <w:t>rokta</w:t>
+      </w:r>
+      <w:proofErr w:type="spellEnd"/>
+      <w:r>
+        <w:t xml:space="preserve"> </w:t>
+      </w:r>
+      <w:proofErr w:type="spellStart"/>
+      <w:r>
+        <w:t>hai</w:t>
+      </w:r>
+      <w:proofErr w:type="spellEnd"/>
+      <w:r>
+        <w:t>.</w:t>
+      </w:r>
+    </w:p>
+    <w:p>
+      <w:pPr>
+        <w:numPr>
+          <w:ilvl w:val="0"/>
+          <w:numId w:val="8"/>
+        </w:numPr>
+      </w:pPr>
+      <w:r>
+        <w:rPr>
+          <w:b/>
+          <w:bCs/>
+        </w:rPr>
+        <w:t>Scalability:</w:t>
+      </w:r>
+      <w:r>
+        <w:t xml:space="preserve"> Agar </w:t>
+      </w:r>
+      <w:proofErr w:type="spellStart"/>
+      <w:r>
+        <w:t>tumhara</w:t>
+      </w:r>
+      <w:proofErr w:type="spellEnd"/>
+      <w:r>
+        <w:t xml:space="preserve"> application </w:t>
+      </w:r>
+      <w:proofErr w:type="spellStart"/>
+      <w:r>
+        <w:t>chota</w:t>
+      </w:r>
+      <w:proofErr w:type="spellEnd"/>
+      <w:r>
+        <w:t xml:space="preserve"> </w:t>
+      </w:r>
+      <w:proofErr w:type="spellStart"/>
+      <w:r>
+        <w:t>hai</w:t>
+      </w:r>
+      <w:proofErr w:type="spellEnd"/>
+      <w:r>
+        <w:t xml:space="preserve"> aur kal ko </w:t>
+      </w:r>
+      <w:proofErr w:type="spellStart"/>
+      <w:r>
+        <w:t>bada</w:t>
+      </w:r>
+      <w:proofErr w:type="spellEnd"/>
+      <w:r>
+        <w:t xml:space="preserve"> </w:t>
+      </w:r>
+      <w:proofErr w:type="spellStart"/>
+      <w:r>
+        <w:t>ho</w:t>
+      </w:r>
+      <w:proofErr w:type="spellEnd"/>
+      <w:r>
+        <w:t xml:space="preserve"> </w:t>
+      </w:r>
+      <w:proofErr w:type="spellStart"/>
+      <w:r>
+        <w:t>gaya</w:t>
+      </w:r>
+      <w:proofErr w:type="spellEnd"/>
+      <w:r>
+        <w:t xml:space="preserve"> (e.g., 40 employees se 1200 employees), </w:t>
+      </w:r>
+      <w:proofErr w:type="spellStart"/>
+      <w:r>
+        <w:t>toh</w:t>
+      </w:r>
+      <w:proofErr w:type="spellEnd"/>
+      <w:r>
+        <w:t xml:space="preserve"> DBMS handle </w:t>
+      </w:r>
+      <w:proofErr w:type="spellStart"/>
+      <w:r>
+        <w:t>kar</w:t>
+      </w:r>
+      <w:proofErr w:type="spellEnd"/>
+      <w:r>
+        <w:t xml:space="preserve"> </w:t>
+      </w:r>
+      <w:proofErr w:type="spellStart"/>
+      <w:r>
+        <w:t>leta</w:t>
+      </w:r>
+      <w:proofErr w:type="spellEnd"/>
+      <w:r>
+        <w:t xml:space="preserve"> </w:t>
+      </w:r>
+      <w:proofErr w:type="spellStart"/>
+      <w:r>
+        <w:t>hai</w:t>
+      </w:r>
+      <w:proofErr w:type="spellEnd"/>
+      <w:r>
+        <w:t>.</w:t>
+      </w:r>
+    </w:p>
+    <w:p>
+      <w:pPr>
+        <w:numPr>
+          <w:ilvl w:val="0"/>
+          <w:numId w:val="8"/>
+        </w:numPr>
+      </w:pPr>
+      <w:r>
+        <w:rPr>
+          <w:b/>
+          <w:bCs/>
+        </w:rPr>
+        <w:t>Data Abstraction:</w:t>
+      </w:r>
+      <w:r>
+        <w:t xml:space="preserve"> User ko </w:t>
+      </w:r>
+      <w:proofErr w:type="spellStart"/>
+      <w:r>
+        <w:t>sirf</w:t>
+      </w:r>
+      <w:proofErr w:type="spellEnd"/>
+      <w:r>
+        <w:t xml:space="preserve"> </w:t>
+      </w:r>
+      <w:proofErr w:type="spellStart"/>
+      <w:r>
+        <w:t>wahi</w:t>
+      </w:r>
+      <w:proofErr w:type="spellEnd"/>
+      <w:r>
+        <w:t xml:space="preserve"> </w:t>
+      </w:r>
+      <w:proofErr w:type="spellStart"/>
+      <w:r>
+        <w:t>dikhta</w:t>
+      </w:r>
+      <w:proofErr w:type="spellEnd"/>
+      <w:r>
+        <w:t xml:space="preserve"> </w:t>
+      </w:r>
+      <w:proofErr w:type="spellStart"/>
+      <w:r>
+        <w:t>hai</w:t>
+      </w:r>
+      <w:proofErr w:type="spellEnd"/>
+      <w:r>
+        <w:t xml:space="preserve"> jo </w:t>
+      </w:r>
+      <w:proofErr w:type="spellStart"/>
+      <w:r>
+        <w:t>usse</w:t>
+      </w:r>
+      <w:proofErr w:type="spellEnd"/>
+      <w:r>
+        <w:t xml:space="preserve"> </w:t>
+      </w:r>
+      <w:proofErr w:type="spellStart"/>
+      <w:r>
+        <w:t>dekhna</w:t>
+      </w:r>
+      <w:proofErr w:type="spellEnd"/>
+      <w:r>
+        <w:t xml:space="preserve"> </w:t>
+      </w:r>
+      <w:proofErr w:type="spellStart"/>
+      <w:r>
+        <w:t>hai</w:t>
+      </w:r>
+      <w:proofErr w:type="spellEnd"/>
+      <w:r>
+        <w:t>. Backend ki complexity (</w:t>
+      </w:r>
+      <w:proofErr w:type="spellStart"/>
+      <w:r>
+        <w:t>jaise</w:t>
+      </w:r>
+      <w:proofErr w:type="spellEnd"/>
+      <w:r>
+        <w:t xml:space="preserve"> data </w:t>
+      </w:r>
+      <w:proofErr w:type="spellStart"/>
+      <w:r>
+        <w:t>kahan</w:t>
+      </w:r>
+      <w:proofErr w:type="spellEnd"/>
+      <w:r>
+        <w:t xml:space="preserve"> aur </w:t>
+      </w:r>
+      <w:proofErr w:type="spellStart"/>
+      <w:r>
+        <w:t>kaise</w:t>
+      </w:r>
+      <w:proofErr w:type="spellEnd"/>
+      <w:r>
+        <w:t xml:space="preserve"> store </w:t>
+      </w:r>
+      <w:proofErr w:type="spellStart"/>
+      <w:r>
+        <w:t>ho</w:t>
+      </w:r>
+      <w:proofErr w:type="spellEnd"/>
+      <w:r>
+        <w:t xml:space="preserve"> </w:t>
+      </w:r>
+      <w:proofErr w:type="spellStart"/>
+      <w:r>
+        <w:t>raha</w:t>
+      </w:r>
+      <w:proofErr w:type="spellEnd"/>
+      <w:r>
+        <w:t xml:space="preserve"> </w:t>
+      </w:r>
+      <w:proofErr w:type="spellStart"/>
+      <w:r>
+        <w:t>hai</w:t>
+      </w:r>
+      <w:proofErr w:type="spellEnd"/>
+      <w:r>
+        <w:t xml:space="preserve">) user se hide </w:t>
+      </w:r>
+      <w:proofErr w:type="spellStart"/>
+      <w:r>
+        <w:t>rehti</w:t>
+      </w:r>
+      <w:proofErr w:type="spellEnd"/>
+      <w:r>
+        <w:t xml:space="preserve"> </w:t>
+      </w:r>
+      <w:proofErr w:type="spellStart"/>
+      <w:r>
+        <w:t>hai</w:t>
+      </w:r>
+      <w:proofErr w:type="spellEnd"/>
+      <w:r>
+        <w:t>.</w:t>
+      </w:r>
+    </w:p>
+    <w:p>
+      <w:pPr>
+        <w:rPr>
+          <w:b/>
+          <w:bCs/>
+        </w:rPr>
+      </w:pPr>
+      <w:r>
+        <w:rPr>
+          <w:b/>
+          <w:bCs/>
+        </w:rPr>
+        <w:t>3. Disadvantages of DBMS (Cons)</w:t>
+      </w:r>
+    </w:p>
+    <w:p>
+      <w:pPr>
+        <w:numPr>
+          <w:ilvl w:val="0"/>
+          <w:numId w:val="9"/>
+        </w:numPr>
+      </w:pPr>
+      <w:r>
+        <w:rPr>
+          <w:b/>
+          <w:bCs/>
+        </w:rPr>
+        <w:t>Cost:</w:t>
+      </w:r>
+      <w:r>
+        <w:t xml:space="preserve"> DBMS software aur </w:t>
+      </w:r>
+      <w:proofErr w:type="spellStart"/>
+      <w:r>
+        <w:t>usko</w:t>
+      </w:r>
+      <w:proofErr w:type="spellEnd"/>
+      <w:r>
+        <w:t xml:space="preserve"> </w:t>
+      </w:r>
+      <w:proofErr w:type="spellStart"/>
+      <w:r>
+        <w:t>chalane</w:t>
+      </w:r>
+      <w:proofErr w:type="spellEnd"/>
+      <w:r>
+        <w:t xml:space="preserve"> </w:t>
+      </w:r>
+      <w:proofErr w:type="spellStart"/>
+      <w:r>
+        <w:t>ke</w:t>
+      </w:r>
+      <w:proofErr w:type="spellEnd"/>
+      <w:r>
+        <w:t xml:space="preserve"> </w:t>
+      </w:r>
+      <w:proofErr w:type="spellStart"/>
+      <w:r>
+        <w:t>liye</w:t>
+      </w:r>
+      <w:proofErr w:type="spellEnd"/>
+      <w:r>
+        <w:t xml:space="preserve"> required hardware (servers/memory) </w:t>
+      </w:r>
+      <w:proofErr w:type="spellStart"/>
+      <w:r>
+        <w:t>kaafi</w:t>
+      </w:r>
+      <w:proofErr w:type="spellEnd"/>
+      <w:r>
+        <w:t xml:space="preserve"> </w:t>
+      </w:r>
+      <w:proofErr w:type="spellStart"/>
+      <w:r>
+        <w:t>mehenge</w:t>
+      </w:r>
+      <w:proofErr w:type="spellEnd"/>
+      <w:r>
+        <w:t xml:space="preserve"> </w:t>
+      </w:r>
+      <w:proofErr w:type="spellStart"/>
+      <w:r>
+        <w:t>ho</w:t>
+      </w:r>
+      <w:proofErr w:type="spellEnd"/>
+      <w:r>
+        <w:t xml:space="preserve"> </w:t>
+      </w:r>
+      <w:proofErr w:type="spellStart"/>
+      <w:r>
+        <w:t>sakte</w:t>
+      </w:r>
+      <w:proofErr w:type="spellEnd"/>
+      <w:r>
+        <w:t xml:space="preserve"> hain.</w:t>
+      </w:r>
+    </w:p>
+    <w:p>
+      <w:pPr>
+        <w:numPr>
+          <w:ilvl w:val="0"/>
+          <w:numId w:val="9"/>
+        </w:numPr>
+      </w:pPr>
+      <w:r>
+        <w:rPr>
+          <w:b/>
+          <w:bCs/>
+        </w:rPr>
+        <w:t>Overhead for Small Projects:</w:t>
+      </w:r>
+      <w:r>
+        <w:t xml:space="preserve"> Agar </w:t>
+      </w:r>
+      <w:proofErr w:type="spellStart"/>
+      <w:r>
+        <w:t>tumhara</w:t>
+      </w:r>
+      <w:proofErr w:type="spellEnd"/>
+      <w:r>
+        <w:t xml:space="preserve"> project bahut </w:t>
+      </w:r>
+      <w:proofErr w:type="spellStart"/>
+      <w:r>
+        <w:t>chota</w:t>
+      </w:r>
+      <w:proofErr w:type="spellEnd"/>
+      <w:r>
+        <w:t xml:space="preserve"> </w:t>
+      </w:r>
+      <w:proofErr w:type="spellStart"/>
+      <w:r>
+        <w:t>hai</w:t>
+      </w:r>
+      <w:proofErr w:type="spellEnd"/>
+      <w:r>
+        <w:t xml:space="preserve"> (</w:t>
+      </w:r>
+      <w:proofErr w:type="spellStart"/>
+      <w:r>
+        <w:t>sirf</w:t>
+      </w:r>
+      <w:proofErr w:type="spellEnd"/>
+      <w:r>
+        <w:t xml:space="preserve"> 20 logon ka data), </w:t>
+      </w:r>
+      <w:proofErr w:type="spellStart"/>
+      <w:r>
+        <w:t>toh</w:t>
+      </w:r>
+      <w:proofErr w:type="spellEnd"/>
+      <w:r>
+        <w:t xml:space="preserve"> DBMS use </w:t>
+      </w:r>
+      <w:proofErr w:type="spellStart"/>
+      <w:r>
+        <w:t>karna</w:t>
+      </w:r>
+      <w:proofErr w:type="spellEnd"/>
+      <w:r>
+        <w:t xml:space="preserve"> "Overkill" </w:t>
+      </w:r>
+      <w:proofErr w:type="spellStart"/>
+      <w:r>
+        <w:t>ho</w:t>
+      </w:r>
+      <w:proofErr w:type="spellEnd"/>
+      <w:r>
+        <w:t xml:space="preserve"> </w:t>
+      </w:r>
+      <w:proofErr w:type="spellStart"/>
+      <w:r>
+        <w:t>sakta</w:t>
+      </w:r>
+      <w:proofErr w:type="spellEnd"/>
+      <w:r>
+        <w:t xml:space="preserve"> </w:t>
+      </w:r>
+      <w:proofErr w:type="spellStart"/>
+      <w:r>
+        <w:t>hai</w:t>
+      </w:r>
+      <w:proofErr w:type="spellEnd"/>
+      <w:r>
+        <w:t xml:space="preserve">. Ye </w:t>
+      </w:r>
+      <w:proofErr w:type="spellStart"/>
+      <w:r>
+        <w:t>faltu</w:t>
+      </w:r>
+      <w:proofErr w:type="spellEnd"/>
+      <w:r>
+        <w:t xml:space="preserve"> ki complexity aur cost </w:t>
+      </w:r>
+      <w:proofErr w:type="spellStart"/>
+      <w:r>
+        <w:t>badhata</w:t>
+      </w:r>
+      <w:proofErr w:type="spellEnd"/>
+      <w:r>
+        <w:t xml:space="preserve"> </w:t>
+      </w:r>
+      <w:proofErr w:type="spellStart"/>
+      <w:r>
+        <w:t>hai</w:t>
+      </w:r>
+      <w:proofErr w:type="spellEnd"/>
+      <w:r>
+        <w:t>.</w:t>
+      </w:r>
+    </w:p>
+    <w:p>
+      <w:pPr>
+        <w:numPr>
+          <w:ilvl w:val="0"/>
+          <w:numId w:val="9"/>
+        </w:numPr>
+      </w:pPr>
+      <w:r>
+        <w:rPr>
+          <w:b/>
+          <w:bCs/>
+        </w:rPr>
+        <w:t>Vendor Lock-in:</w:t>
+      </w:r>
+      <w:r>
+        <w:t xml:space="preserve"> Ek </w:t>
+      </w:r>
+      <w:proofErr w:type="spellStart"/>
+      <w:r>
+        <w:t>baar</w:t>
+      </w:r>
+      <w:proofErr w:type="spellEnd"/>
+      <w:r>
+        <w:t xml:space="preserve"> </w:t>
+      </w:r>
+      <w:proofErr w:type="spellStart"/>
+      <w:r>
+        <w:t>tumne</w:t>
+      </w:r>
+      <w:proofErr w:type="spellEnd"/>
+      <w:r>
+        <w:t xml:space="preserve"> ek specific DBMS </w:t>
+      </w:r>
+      <w:proofErr w:type="spellStart"/>
+      <w:r>
+        <w:t>chuna</w:t>
+      </w:r>
+      <w:proofErr w:type="spellEnd"/>
+      <w:r>
+        <w:t xml:space="preserve"> (e.g., MySQL), </w:t>
+      </w:r>
+      <w:proofErr w:type="spellStart"/>
+      <w:r>
+        <w:t>toh</w:t>
+      </w:r>
+      <w:proofErr w:type="spellEnd"/>
+      <w:r>
+        <w:t xml:space="preserve"> </w:t>
+      </w:r>
+      <w:proofErr w:type="spellStart"/>
+      <w:r>
+        <w:t>usse</w:t>
+      </w:r>
+      <w:proofErr w:type="spellEnd"/>
+      <w:r>
+        <w:t xml:space="preserve"> </w:t>
+      </w:r>
+      <w:proofErr w:type="spellStart"/>
+      <w:r>
+        <w:t>kisi</w:t>
+      </w:r>
+      <w:proofErr w:type="spellEnd"/>
+      <w:r>
+        <w:t xml:space="preserve"> </w:t>
+      </w:r>
+      <w:proofErr w:type="spellStart"/>
+      <w:r>
+        <w:t>doosre</w:t>
+      </w:r>
+      <w:proofErr w:type="spellEnd"/>
+      <w:r>
+        <w:t xml:space="preserve"> DBMS (e.g., NoSQL) pe switch </w:t>
+      </w:r>
+      <w:proofErr w:type="spellStart"/>
+      <w:r>
+        <w:t>karna</w:t>
+      </w:r>
+      <w:proofErr w:type="spellEnd"/>
+      <w:r>
+        <w:t xml:space="preserve"> bahut </w:t>
+      </w:r>
+      <w:proofErr w:type="spellStart"/>
+      <w:r>
+        <w:t>mushkil</w:t>
+      </w:r>
+      <w:proofErr w:type="spellEnd"/>
+      <w:r>
+        <w:t xml:space="preserve"> </w:t>
+      </w:r>
+      <w:proofErr w:type="spellStart"/>
+      <w:r>
+        <w:t>hota</w:t>
+      </w:r>
+      <w:proofErr w:type="spellEnd"/>
+      <w:r>
+        <w:t xml:space="preserve"> </w:t>
+      </w:r>
+      <w:proofErr w:type="spellStart"/>
+      <w:r>
+        <w:t>hai</w:t>
+      </w:r>
+      <w:proofErr w:type="spellEnd"/>
+      <w:r>
+        <w:t xml:space="preserve">. Format, queries, aur logic sab </w:t>
+      </w:r>
+      <w:proofErr w:type="spellStart"/>
+      <w:r>
+        <w:t>alag</w:t>
+      </w:r>
+      <w:proofErr w:type="spellEnd"/>
+      <w:r>
+        <w:t xml:space="preserve"> </w:t>
+      </w:r>
+      <w:proofErr w:type="spellStart"/>
+      <w:r>
+        <w:t>hote</w:t>
+      </w:r>
+      <w:proofErr w:type="spellEnd"/>
+      <w:r>
+        <w:t xml:space="preserve"> hain, jo migration </w:t>
+      </w:r>
+      <w:proofErr w:type="spellStart"/>
+      <w:r>
+        <w:t>mein</w:t>
+      </w:r>
+      <w:proofErr w:type="spellEnd"/>
+      <w:r>
+        <w:t xml:space="preserve"> bahut </w:t>
+      </w:r>
+      <w:proofErr w:type="spellStart"/>
+      <w:r>
+        <w:t>dikkat</w:t>
+      </w:r>
+      <w:proofErr w:type="spellEnd"/>
+      <w:r>
+        <w:t xml:space="preserve"> </w:t>
+      </w:r>
+      <w:proofErr w:type="spellStart"/>
+      <w:r>
+        <w:t>dete</w:t>
+      </w:r>
+      <w:proofErr w:type="spellEnd"/>
+      <w:r>
+        <w:t xml:space="preserve"> hain.</w:t>
+      </w:r>
+    </w:p>
+    <w:p>
+      <w:pPr>
+        <w:rPr>
+          <w:b/>
+          <w:bCs/>
+        </w:rPr>
+      </w:pPr>
+      <w:r>
+        <w:rPr>
+          <w:b/>
+          <w:bCs/>
+        </w:rPr>
+        <w:t>Key Takeaway for your notes:</w:t>
+      </w:r>
+    </w:p>
+    <w:p>
+      <w:r>
+        <w:t xml:space="preserve">"DBMS ek double-edged sword </w:t>
+      </w:r>
+      <w:proofErr w:type="spellStart"/>
+      <w:r>
+        <w:t>hai</w:t>
+      </w:r>
+      <w:proofErr w:type="spellEnd"/>
+      <w:r>
+        <w:t xml:space="preserve">. Jab data </w:t>
+      </w:r>
+      <w:proofErr w:type="spellStart"/>
+      <w:r>
+        <w:t>bada</w:t>
+      </w:r>
+      <w:proofErr w:type="spellEnd"/>
+      <w:r>
+        <w:t xml:space="preserve"> </w:t>
+      </w:r>
+      <w:proofErr w:type="spellStart"/>
+      <w:r>
+        <w:t>ho</w:t>
+      </w:r>
+      <w:proofErr w:type="spellEnd"/>
+      <w:r>
+        <w:t xml:space="preserve"> aur security/consistency matter </w:t>
+      </w:r>
+      <w:proofErr w:type="spellStart"/>
+      <w:r>
+        <w:t>karti</w:t>
+      </w:r>
+      <w:proofErr w:type="spellEnd"/>
+      <w:r>
+        <w:t xml:space="preserve"> </w:t>
+      </w:r>
+      <w:proofErr w:type="spellStart"/>
+      <w:r>
+        <w:t>ho</w:t>
+      </w:r>
+      <w:proofErr w:type="spellEnd"/>
+      <w:r>
+        <w:t xml:space="preserve">, </w:t>
+      </w:r>
+      <w:proofErr w:type="spellStart"/>
+      <w:r>
+        <w:t>toh</w:t>
+      </w:r>
+      <w:proofErr w:type="spellEnd"/>
+      <w:r>
+        <w:t xml:space="preserve"> DBMS best </w:t>
+      </w:r>
+      <w:proofErr w:type="spellStart"/>
+      <w:r>
+        <w:t>hai</w:t>
+      </w:r>
+      <w:proofErr w:type="spellEnd"/>
+      <w:r>
+        <w:t xml:space="preserve">. Lekin </w:t>
+      </w:r>
+      <w:proofErr w:type="spellStart"/>
+      <w:r>
+        <w:t>chote</w:t>
+      </w:r>
+      <w:proofErr w:type="spellEnd"/>
+      <w:r>
+        <w:t xml:space="preserve"> aur simple applications </w:t>
+      </w:r>
+      <w:proofErr w:type="spellStart"/>
+      <w:r>
+        <w:t>ke</w:t>
+      </w:r>
+      <w:proofErr w:type="spellEnd"/>
+      <w:r>
+        <w:t xml:space="preserve"> </w:t>
+      </w:r>
+      <w:proofErr w:type="spellStart"/>
+      <w:r>
+        <w:t>liye</w:t>
+      </w:r>
+      <w:proofErr w:type="spellEnd"/>
+      <w:r>
+        <w:t xml:space="preserve">, ye unnecessary complexity aur cost add </w:t>
+      </w:r>
+      <w:proofErr w:type="spellStart"/>
+      <w:r>
+        <w:t>kar</w:t>
+      </w:r>
+      <w:proofErr w:type="spellEnd"/>
+      <w:r>
+        <w:t xml:space="preserve"> </w:t>
+      </w:r>
+      <w:proofErr w:type="spellStart"/>
+      <w:r>
+        <w:t>sakta</w:t>
+      </w:r>
+      <w:proofErr w:type="spellEnd"/>
+      <w:r>
+        <w:t xml:space="preserve"> </w:t>
+      </w:r>
+      <w:proofErr w:type="spellStart"/>
+      <w:r>
+        <w:t>hai</w:t>
+      </w:r>
+      <w:proofErr w:type="spellEnd"/>
+      <w:r>
+        <w:t>."</w:t>
+      </w:r>
+    </w:p>
+    <w:p>
+      <w:r>
+        <w:pict w14:anchorId="1BE56C4A">
+          <v:rect id="_x0000_i1054" style="width:0;height:1.5pt" o:hralign="center" o:bullet="t" o:hrstd="t" o:hr="t" fillcolor="#a0a0a0" stroked="f"/>
+        </w:pict>
       </w:r>
     </w:p>
     <w:p/>
@@ -2266,7 +4870,17 @@
 <w:numbering xmlns:wpc="http://schemas.microsoft.com/office/word/2010/wordprocessingCanvas" xmlns:cx="http://schemas.microsoft.com/office/drawing/2014/chartex" xmlns:cx1="http://schemas.microsoft.com/office/drawing/2015/9/8/chartex" xmlns:cx2="http://schemas.microsoft.com/office/drawing/2015/10/21/chartex" xmlns:cx3="http://schemas.microsoft.com/office/drawing/2016/5/9/chartex" xmlns:cx4="http://schemas.microsoft.com/office/drawing/2016/5/10/chartex" xmlns:cx5="http://schemas.microsoft.com/office/drawing/2016/5/11/chartex" xmlns:cx6="http://schemas.microsoft.com/office/drawing/2016/5/12/chartex" xmlns:cx7="http://schemas.microsoft.com/office/drawing/2016/5/13/chartex" xmlns:cx8="http://schemas.microsoft.com/office/drawing/2016/5/14/chartex" xmlns:mc="http://schemas.openxmlformats.org/markup-compatibility/2006" xmlns:aink="http://schemas.microsoft.com/office/drawing/2016/ink" xmlns:am3d="http://schemas.microsoft.com/office/drawing/2017/model3d" xmlns:o="urn:schemas-microsoft-com:office:office" xmlns:oel="http://schemas.microsoft.com/office/2019/extlst" xmlns:r="http://schemas.openxmlformats.org/officeDocument/2006/relationships" xmlns:m="http://schemas.openxmlformats.org/officeDocument/2006/math" xmlns:v="urn:schemas-microsoft-com:vml" xmlns:wp14="http://schemas.microsoft.com/office/word/2010/wordprocessingDrawing" xmlns:wp="http://schemas.openxmlformats.org/drawingml/2006/wordprocessingDrawing" xmlns:w10="urn:schemas-microsoft-com:office:word" xmlns:w="http://schemas.openxmlformats.org/wordprocessingml/2006/main" xmlns:w14="http://schemas.microsoft.com/office/word/2010/wordml" xmlns:w15="http://schemas.microsoft.com/office/word/2012/wordml" xmlns:w16cex="http://schemas.microsoft.com/office/word/2018/wordml/cex" xmlns:w16cid="http://schemas.microsoft.com/office/word/2016/wordml/cid" xmlns:w16="http://schemas.microsoft.com/office/word/2018/wordml" xmlns:w16du="http://schemas.microsoft.com/office/word/2023/wordml/word16du" xmlns:w16sdtdh="http://schemas.microsoft.com/office/word/2020/wordml/sdtdatahash" xmlns:w16sdtfl="http://schemas.microsoft.com/office/word/2024/wordml/sdtformatlock" xmlns:w16se="http://schemas.microsoft.com/office/word/2015/wordml/symex" xmlns:wpg="http://schemas.microsoft.com/office/word/2010/wordprocessingGroup" xmlns:wpi="http://schemas.microsoft.com/office/word/2010/wordprocessingInk" xmlns:wne="http://schemas.microsoft.com/office/word/2006/wordml" xmlns:wps="http://schemas.microsoft.com/office/word/2010/wordprocessingShape" mc:Ignorable="w14 w15 w16se w16cid w16 w16cex w16sdtdh w16sdtfl w16du wp14">
   <w:numPicBullet w:numPicBulletId="0">
     <w:pict>
-      <v:rect id="_x0000_i1032" style="width:0;height:1.5pt" o:hralign="center" o:bullet="t" o:hrstd="t" o:hr="t" fillcolor="#a0a0a0" stroked="f"/>
+      <v:rect id="_x0000_i1065" style="width:0;height:1.5pt" o:hralign="center" o:bullet="t" o:hrstd="t" o:hr="t" fillcolor="#a0a0a0" stroked="f"/>
+    </w:pict>
+  </w:numPicBullet>
+  <w:numPicBullet w:numPicBulletId="1">
+    <w:pict>
+      <v:rect id="_x0000_i1066" style="width:0;height:1.5pt" o:hralign="center" o:bullet="t" o:hrstd="t" o:hr="t" fillcolor="#a0a0a0" stroked="f"/>
+    </w:pict>
+  </w:numPicBullet>
+  <w:numPicBullet w:numPicBulletId="2">
+    <w:pict>
+      <v:rect id="_x0000_i1067" style="width:0;height:1.5pt" o:hralign="center" o:bullet="t" o:hrstd="t" o:hr="t" fillcolor="#a0a0a0" stroked="f"/>
     </w:pict>
   </w:numPicBullet>
   <w:abstractNum w:abstractNumId="0" w15:restartNumberingAfterBreak="0">
@@ -2419,6 +5033,304 @@
     </w:lvl>
   </w:abstractNum>
   <w:abstractNum w:abstractNumId="1" w15:restartNumberingAfterBreak="0">
+    <w:nsid w:val="09077C77"/>
+    <w:multiLevelType w:val="multilevel"/>
+    <w:tmpl w:val="6930CE88"/>
+    <w:lvl w:ilvl="0">
+      <w:start w:val="1"/>
+      <w:numFmt w:val="bullet"/>
+      <w:lvlText w:val=""/>
+      <w:lvlJc w:val="left"/>
+      <w:pPr>
+        <w:tabs>
+          <w:tab w:val="num" w:pos="720"/>
+        </w:tabs>
+        <w:ind w:left="720" w:hanging="360"/>
+      </w:pPr>
+      <w:rPr>
+        <w:rFonts w:ascii="Symbol" w:hAnsi="Symbol" w:hint="default"/>
+        <w:sz w:val="20"/>
+      </w:rPr>
+    </w:lvl>
+    <w:lvl w:ilvl="1" w:tentative="1">
+      <w:start w:val="1"/>
+      <w:numFmt w:val="bullet"/>
+      <w:lvlText w:val="o"/>
+      <w:lvlJc w:val="left"/>
+      <w:pPr>
+        <w:tabs>
+          <w:tab w:val="num" w:pos="1440"/>
+        </w:tabs>
+        <w:ind w:left="1440" w:hanging="360"/>
+      </w:pPr>
+      <w:rPr>
+        <w:rFonts w:ascii="Courier New" w:hAnsi="Courier New" w:hint="default"/>
+        <w:sz w:val="20"/>
+      </w:rPr>
+    </w:lvl>
+    <w:lvl w:ilvl="2" w:tentative="1">
+      <w:start w:val="1"/>
+      <w:numFmt w:val="bullet"/>
+      <w:lvlText w:val=""/>
+      <w:lvlJc w:val="left"/>
+      <w:pPr>
+        <w:tabs>
+          <w:tab w:val="num" w:pos="2160"/>
+        </w:tabs>
+        <w:ind w:left="2160" w:hanging="360"/>
+      </w:pPr>
+      <w:rPr>
+        <w:rFonts w:ascii="Wingdings" w:hAnsi="Wingdings" w:hint="default"/>
+        <w:sz w:val="20"/>
+      </w:rPr>
+    </w:lvl>
+    <w:lvl w:ilvl="3" w:tentative="1">
+      <w:start w:val="1"/>
+      <w:numFmt w:val="bullet"/>
+      <w:lvlText w:val=""/>
+      <w:lvlJc w:val="left"/>
+      <w:pPr>
+        <w:tabs>
+          <w:tab w:val="num" w:pos="2880"/>
+        </w:tabs>
+        <w:ind w:left="2880" w:hanging="360"/>
+      </w:pPr>
+      <w:rPr>
+        <w:rFonts w:ascii="Wingdings" w:hAnsi="Wingdings" w:hint="default"/>
+        <w:sz w:val="20"/>
+      </w:rPr>
+    </w:lvl>
+    <w:lvl w:ilvl="4" w:tentative="1">
+      <w:start w:val="1"/>
+      <w:numFmt w:val="bullet"/>
+      <w:lvlText w:val=""/>
+      <w:lvlJc w:val="left"/>
+      <w:pPr>
+        <w:tabs>
+          <w:tab w:val="num" w:pos="3600"/>
+        </w:tabs>
+        <w:ind w:left="3600" w:hanging="360"/>
+      </w:pPr>
+      <w:rPr>
+        <w:rFonts w:ascii="Wingdings" w:hAnsi="Wingdings" w:hint="default"/>
+        <w:sz w:val="20"/>
+      </w:rPr>
+    </w:lvl>
+    <w:lvl w:ilvl="5" w:tentative="1">
+      <w:start w:val="1"/>
+      <w:numFmt w:val="bullet"/>
+      <w:lvlText w:val=""/>
+      <w:lvlJc w:val="left"/>
+      <w:pPr>
+        <w:tabs>
+          <w:tab w:val="num" w:pos="4320"/>
+        </w:tabs>
+        <w:ind w:left="4320" w:hanging="360"/>
+      </w:pPr>
+      <w:rPr>
+        <w:rFonts w:ascii="Wingdings" w:hAnsi="Wingdings" w:hint="default"/>
+        <w:sz w:val="20"/>
+      </w:rPr>
+    </w:lvl>
+    <w:lvl w:ilvl="6" w:tentative="1">
+      <w:start w:val="1"/>
+      <w:numFmt w:val="bullet"/>
+      <w:lvlText w:val=""/>
+      <w:lvlJc w:val="left"/>
+      <w:pPr>
+        <w:tabs>
+          <w:tab w:val="num" w:pos="5040"/>
+        </w:tabs>
+        <w:ind w:left="5040" w:hanging="360"/>
+      </w:pPr>
+      <w:rPr>
+        <w:rFonts w:ascii="Wingdings" w:hAnsi="Wingdings" w:hint="default"/>
+        <w:sz w:val="20"/>
+      </w:rPr>
+    </w:lvl>
+    <w:lvl w:ilvl="7" w:tentative="1">
+      <w:start w:val="1"/>
+      <w:numFmt w:val="bullet"/>
+      <w:lvlText w:val=""/>
+      <w:lvlJc w:val="left"/>
+      <w:pPr>
+        <w:tabs>
+          <w:tab w:val="num" w:pos="5760"/>
+        </w:tabs>
+        <w:ind w:left="5760" w:hanging="360"/>
+      </w:pPr>
+      <w:rPr>
+        <w:rFonts w:ascii="Wingdings" w:hAnsi="Wingdings" w:hint="default"/>
+        <w:sz w:val="20"/>
+      </w:rPr>
+    </w:lvl>
+    <w:lvl w:ilvl="8" w:tentative="1">
+      <w:start w:val="1"/>
+      <w:numFmt w:val="bullet"/>
+      <w:lvlText w:val=""/>
+      <w:lvlJc w:val="left"/>
+      <w:pPr>
+        <w:tabs>
+          <w:tab w:val="num" w:pos="6480"/>
+        </w:tabs>
+        <w:ind w:left="6480" w:hanging="360"/>
+      </w:pPr>
+      <w:rPr>
+        <w:rFonts w:ascii="Wingdings" w:hAnsi="Wingdings" w:hint="default"/>
+        <w:sz w:val="20"/>
+      </w:rPr>
+    </w:lvl>
+  </w:abstractNum>
+  <w:abstractNum w:abstractNumId="2" w15:restartNumberingAfterBreak="0">
+    <w:nsid w:val="0B4F76B7"/>
+    <w:multiLevelType w:val="multilevel"/>
+    <w:tmpl w:val="3C1A325A"/>
+    <w:lvl w:ilvl="0">
+      <w:start w:val="1"/>
+      <w:numFmt w:val="bullet"/>
+      <w:lvlText w:val=""/>
+      <w:lvlJc w:val="left"/>
+      <w:pPr>
+        <w:tabs>
+          <w:tab w:val="num" w:pos="720"/>
+        </w:tabs>
+        <w:ind w:left="720" w:hanging="360"/>
+      </w:pPr>
+      <w:rPr>
+        <w:rFonts w:ascii="Symbol" w:hAnsi="Symbol" w:hint="default"/>
+        <w:sz w:val="20"/>
+      </w:rPr>
+    </w:lvl>
+    <w:lvl w:ilvl="1" w:tentative="1">
+      <w:start w:val="1"/>
+      <w:numFmt w:val="bullet"/>
+      <w:lvlText w:val="o"/>
+      <w:lvlJc w:val="left"/>
+      <w:pPr>
+        <w:tabs>
+          <w:tab w:val="num" w:pos="1440"/>
+        </w:tabs>
+        <w:ind w:left="1440" w:hanging="360"/>
+      </w:pPr>
+      <w:rPr>
+        <w:rFonts w:ascii="Courier New" w:hAnsi="Courier New" w:hint="default"/>
+        <w:sz w:val="20"/>
+      </w:rPr>
+    </w:lvl>
+    <w:lvl w:ilvl="2" w:tentative="1">
+      <w:start w:val="1"/>
+      <w:numFmt w:val="bullet"/>
+      <w:lvlText w:val=""/>
+      <w:lvlJc w:val="left"/>
+      <w:pPr>
+        <w:tabs>
+          <w:tab w:val="num" w:pos="2160"/>
+        </w:tabs>
+        <w:ind w:left="2160" w:hanging="360"/>
+      </w:pPr>
+      <w:rPr>
+        <w:rFonts w:ascii="Wingdings" w:hAnsi="Wingdings" w:hint="default"/>
+        <w:sz w:val="20"/>
+      </w:rPr>
+    </w:lvl>
+    <w:lvl w:ilvl="3" w:tentative="1">
+      <w:start w:val="1"/>
+      <w:numFmt w:val="bullet"/>
+      <w:lvlText w:val=""/>
+      <w:lvlJc w:val="left"/>
+      <w:pPr>
+        <w:tabs>
+          <w:tab w:val="num" w:pos="2880"/>
+        </w:tabs>
+        <w:ind w:left="2880" w:hanging="360"/>
+      </w:pPr>
+      <w:rPr>
+        <w:rFonts w:ascii="Wingdings" w:hAnsi="Wingdings" w:hint="default"/>
+        <w:sz w:val="20"/>
+      </w:rPr>
+    </w:lvl>
+    <w:lvl w:ilvl="4" w:tentative="1">
+      <w:start w:val="1"/>
+      <w:numFmt w:val="bullet"/>
+      <w:lvlText w:val=""/>
+      <w:lvlJc w:val="left"/>
+      <w:pPr>
+        <w:tabs>
+          <w:tab w:val="num" w:pos="3600"/>
+        </w:tabs>
+        <w:ind w:left="3600" w:hanging="360"/>
+      </w:pPr>
+      <w:rPr>
+        <w:rFonts w:ascii="Wingdings" w:hAnsi="Wingdings" w:hint="default"/>
+        <w:sz w:val="20"/>
+      </w:rPr>
+    </w:lvl>
+    <w:lvl w:ilvl="5" w:tentative="1">
+      <w:start w:val="1"/>
+      <w:numFmt w:val="bullet"/>
+      <w:lvlText w:val=""/>
+      <w:lvlJc w:val="left"/>
+      <w:pPr>
+        <w:tabs>
+          <w:tab w:val="num" w:pos="4320"/>
+        </w:tabs>
+        <w:ind w:left="4320" w:hanging="360"/>
+      </w:pPr>
+      <w:rPr>
+        <w:rFonts w:ascii="Wingdings" w:hAnsi="Wingdings" w:hint="default"/>
+        <w:sz w:val="20"/>
+      </w:rPr>
+    </w:lvl>
+    <w:lvl w:ilvl="6" w:tentative="1">
+      <w:start w:val="1"/>
+      <w:numFmt w:val="bullet"/>
+      <w:lvlText w:val=""/>
+      <w:lvlJc w:val="left"/>
+      <w:pPr>
+        <w:tabs>
+          <w:tab w:val="num" w:pos="5040"/>
+        </w:tabs>
+        <w:ind w:left="5040" w:hanging="360"/>
+      </w:pPr>
+      <w:rPr>
+        <w:rFonts w:ascii="Wingdings" w:hAnsi="Wingdings" w:hint="default"/>
+        <w:sz w:val="20"/>
+      </w:rPr>
+    </w:lvl>
+    <w:lvl w:ilvl="7" w:tentative="1">
+      <w:start w:val="1"/>
+      <w:numFmt w:val="bullet"/>
+      <w:lvlText w:val=""/>
+      <w:lvlJc w:val="left"/>
+      <w:pPr>
+        <w:tabs>
+          <w:tab w:val="num" w:pos="5760"/>
+        </w:tabs>
+        <w:ind w:left="5760" w:hanging="360"/>
+      </w:pPr>
+      <w:rPr>
+        <w:rFonts w:ascii="Wingdings" w:hAnsi="Wingdings" w:hint="default"/>
+        <w:sz w:val="20"/>
+      </w:rPr>
+    </w:lvl>
+    <w:lvl w:ilvl="8" w:tentative="1">
+      <w:start w:val="1"/>
+      <w:numFmt w:val="bullet"/>
+      <w:lvlText w:val=""/>
+      <w:lvlJc w:val="left"/>
+      <w:pPr>
+        <w:tabs>
+          <w:tab w:val="num" w:pos="6480"/>
+        </w:tabs>
+        <w:ind w:left="6480" w:hanging="360"/>
+      </w:pPr>
+      <w:rPr>
+        <w:rFonts w:ascii="Wingdings" w:hAnsi="Wingdings" w:hint="default"/>
+        <w:sz w:val="20"/>
+      </w:rPr>
+    </w:lvl>
+  </w:abstractNum>
+  <w:abstractNum w:abstractNumId="3" w15:restartNumberingAfterBreak="0">
     <w:nsid w:val="19D94310"/>
     <w:multiLevelType w:val="multilevel"/>
     <w:tmpl w:val="03567302"/>
@@ -2567,7 +5479,7 @@
       </w:rPr>
     </w:lvl>
   </w:abstractNum>
-  <w:abstractNum w:abstractNumId="2" w15:restartNumberingAfterBreak="0">
+  <w:abstractNum w:abstractNumId="4" w15:restartNumberingAfterBreak="0">
     <w:nsid w:val="256A1DA2"/>
     <w:multiLevelType w:val="multilevel"/>
     <w:tmpl w:val="27F8AB68"/>
@@ -2716,7 +5628,273 @@
       </w:rPr>
     </w:lvl>
   </w:abstractNum>
-  <w:abstractNum w:abstractNumId="3" w15:restartNumberingAfterBreak="0">
+  <w:abstractNum w:abstractNumId="5" w15:restartNumberingAfterBreak="0">
+    <w:nsid w:val="31007738"/>
+    <w:multiLevelType w:val="multilevel"/>
+    <w:tmpl w:val="F830D53C"/>
+    <w:lvl w:ilvl="0">
+      <w:start w:val="1"/>
+      <w:numFmt w:val="decimal"/>
+      <w:lvlText w:val="%1."/>
+      <w:lvlJc w:val="left"/>
+      <w:pPr>
+        <w:tabs>
+          <w:tab w:val="num" w:pos="720"/>
+        </w:tabs>
+        <w:ind w:left="720" w:hanging="360"/>
+      </w:pPr>
+    </w:lvl>
+    <w:lvl w:ilvl="1">
+      <w:start w:val="1"/>
+      <w:numFmt w:val="bullet"/>
+      <w:lvlText w:val="o"/>
+      <w:lvlJc w:val="left"/>
+      <w:pPr>
+        <w:tabs>
+          <w:tab w:val="num" w:pos="1440"/>
+        </w:tabs>
+        <w:ind w:left="1440" w:hanging="360"/>
+      </w:pPr>
+      <w:rPr>
+        <w:rFonts w:ascii="Courier New" w:hAnsi="Courier New" w:hint="default"/>
+        <w:sz w:val="20"/>
+      </w:rPr>
+    </w:lvl>
+    <w:lvl w:ilvl="2" w:tentative="1">
+      <w:start w:val="1"/>
+      <w:numFmt w:val="decimal"/>
+      <w:lvlText w:val="%3."/>
+      <w:lvlJc w:val="left"/>
+      <w:pPr>
+        <w:tabs>
+          <w:tab w:val="num" w:pos="2160"/>
+        </w:tabs>
+        <w:ind w:left="2160" w:hanging="360"/>
+      </w:pPr>
+    </w:lvl>
+    <w:lvl w:ilvl="3" w:tentative="1">
+      <w:start w:val="1"/>
+      <w:numFmt w:val="decimal"/>
+      <w:lvlText w:val="%4."/>
+      <w:lvlJc w:val="left"/>
+      <w:pPr>
+        <w:tabs>
+          <w:tab w:val="num" w:pos="2880"/>
+        </w:tabs>
+        <w:ind w:left="2880" w:hanging="360"/>
+      </w:pPr>
+    </w:lvl>
+    <w:lvl w:ilvl="4" w:tentative="1">
+      <w:start w:val="1"/>
+      <w:numFmt w:val="decimal"/>
+      <w:lvlText w:val="%5."/>
+      <w:lvlJc w:val="left"/>
+      <w:pPr>
+        <w:tabs>
+          <w:tab w:val="num" w:pos="3600"/>
+        </w:tabs>
+        <w:ind w:left="3600" w:hanging="360"/>
+      </w:pPr>
+    </w:lvl>
+    <w:lvl w:ilvl="5" w:tentative="1">
+      <w:start w:val="1"/>
+      <w:numFmt w:val="decimal"/>
+      <w:lvlText w:val="%6."/>
+      <w:lvlJc w:val="left"/>
+      <w:pPr>
+        <w:tabs>
+          <w:tab w:val="num" w:pos="4320"/>
+        </w:tabs>
+        <w:ind w:left="4320" w:hanging="360"/>
+      </w:pPr>
+    </w:lvl>
+    <w:lvl w:ilvl="6" w:tentative="1">
+      <w:start w:val="1"/>
+      <w:numFmt w:val="decimal"/>
+      <w:lvlText w:val="%7."/>
+      <w:lvlJc w:val="left"/>
+      <w:pPr>
+        <w:tabs>
+          <w:tab w:val="num" w:pos="5040"/>
+        </w:tabs>
+        <w:ind w:left="5040" w:hanging="360"/>
+      </w:pPr>
+    </w:lvl>
+    <w:lvl w:ilvl="7" w:tentative="1">
+      <w:start w:val="1"/>
+      <w:numFmt w:val="decimal"/>
+      <w:lvlText w:val="%8."/>
+      <w:lvlJc w:val="left"/>
+      <w:pPr>
+        <w:tabs>
+          <w:tab w:val="num" w:pos="5760"/>
+        </w:tabs>
+        <w:ind w:left="5760" w:hanging="360"/>
+      </w:pPr>
+    </w:lvl>
+    <w:lvl w:ilvl="8" w:tentative="1">
+      <w:start w:val="1"/>
+      <w:numFmt w:val="decimal"/>
+      <w:lvlText w:val="%9."/>
+      <w:lvlJc w:val="left"/>
+      <w:pPr>
+        <w:tabs>
+          <w:tab w:val="num" w:pos="6480"/>
+        </w:tabs>
+        <w:ind w:left="6480" w:hanging="360"/>
+      </w:pPr>
+    </w:lvl>
+  </w:abstractNum>
+  <w:abstractNum w:abstractNumId="6" w15:restartNumberingAfterBreak="0">
+    <w:nsid w:val="3E2013C6"/>
+    <w:multiLevelType w:val="multilevel"/>
+    <w:tmpl w:val="85CED3F8"/>
+    <w:lvl w:ilvl="0">
+      <w:start w:val="1"/>
+      <w:numFmt w:val="bullet"/>
+      <w:lvlText w:val=""/>
+      <w:lvlJc w:val="left"/>
+      <w:pPr>
+        <w:tabs>
+          <w:tab w:val="num" w:pos="720"/>
+        </w:tabs>
+        <w:ind w:left="720" w:hanging="360"/>
+      </w:pPr>
+      <w:rPr>
+        <w:rFonts w:ascii="Symbol" w:hAnsi="Symbol" w:hint="default"/>
+        <w:sz w:val="20"/>
+      </w:rPr>
+    </w:lvl>
+    <w:lvl w:ilvl="1" w:tentative="1">
+      <w:start w:val="1"/>
+      <w:numFmt w:val="bullet"/>
+      <w:lvlText w:val="o"/>
+      <w:lvlJc w:val="left"/>
+      <w:pPr>
+        <w:tabs>
+          <w:tab w:val="num" w:pos="1440"/>
+        </w:tabs>
+        <w:ind w:left="1440" w:hanging="360"/>
+      </w:pPr>
+      <w:rPr>
+        <w:rFonts w:ascii="Courier New" w:hAnsi="Courier New" w:hint="default"/>
+        <w:sz w:val="20"/>
+      </w:rPr>
+    </w:lvl>
+    <w:lvl w:ilvl="2" w:tentative="1">
+      <w:start w:val="1"/>
+      <w:numFmt w:val="bullet"/>
+      <w:lvlText w:val=""/>
+      <w:lvlJc w:val="left"/>
+      <w:pPr>
+        <w:tabs>
+          <w:tab w:val="num" w:pos="2160"/>
+        </w:tabs>
+        <w:ind w:left="2160" w:hanging="360"/>
+      </w:pPr>
+      <w:rPr>
+        <w:rFonts w:ascii="Wingdings" w:hAnsi="Wingdings" w:hint="default"/>
+        <w:sz w:val="20"/>
+      </w:rPr>
+    </w:lvl>
+    <w:lvl w:ilvl="3" w:tentative="1">
+      <w:start w:val="1"/>
+      <w:numFmt w:val="bullet"/>
+      <w:lvlText w:val=""/>
+      <w:lvlJc w:val="left"/>
+      <w:pPr>
+        <w:tabs>
+          <w:tab w:val="num" w:pos="2880"/>
+        </w:tabs>
+        <w:ind w:left="2880" w:hanging="360"/>
+      </w:pPr>
+      <w:rPr>
+        <w:rFonts w:ascii="Wingdings" w:hAnsi="Wingdings" w:hint="default"/>
+        <w:sz w:val="20"/>
+      </w:rPr>
+    </w:lvl>
+    <w:lvl w:ilvl="4" w:tentative="1">
+      <w:start w:val="1"/>
+      <w:numFmt w:val="bullet"/>
+      <w:lvlText w:val=""/>
+      <w:lvlJc w:val="left"/>
+      <w:pPr>
+        <w:tabs>
+          <w:tab w:val="num" w:pos="3600"/>
+        </w:tabs>
+        <w:ind w:left="3600" w:hanging="360"/>
+      </w:pPr>
+      <w:rPr>
+        <w:rFonts w:ascii="Wingdings" w:hAnsi="Wingdings" w:hint="default"/>
+        <w:sz w:val="20"/>
+      </w:rPr>
+    </w:lvl>
+    <w:lvl w:ilvl="5" w:tentative="1">
+      <w:start w:val="1"/>
+      <w:numFmt w:val="bullet"/>
+      <w:lvlText w:val=""/>
+      <w:lvlJc w:val="left"/>
+      <w:pPr>
+        <w:tabs>
+          <w:tab w:val="num" w:pos="4320"/>
+        </w:tabs>
+        <w:ind w:left="4320" w:hanging="360"/>
+      </w:pPr>
+      <w:rPr>
+        <w:rFonts w:ascii="Wingdings" w:hAnsi="Wingdings" w:hint="default"/>
+        <w:sz w:val="20"/>
+      </w:rPr>
+    </w:lvl>
+    <w:lvl w:ilvl="6" w:tentative="1">
+      <w:start w:val="1"/>
+      <w:numFmt w:val="bullet"/>
+      <w:lvlText w:val=""/>
+      <w:lvlJc w:val="left"/>
+      <w:pPr>
+        <w:tabs>
+          <w:tab w:val="num" w:pos="5040"/>
+        </w:tabs>
+        <w:ind w:left="5040" w:hanging="360"/>
+      </w:pPr>
+      <w:rPr>
+        <w:rFonts w:ascii="Wingdings" w:hAnsi="Wingdings" w:hint="default"/>
+        <w:sz w:val="20"/>
+      </w:rPr>
+    </w:lvl>
+    <w:lvl w:ilvl="7" w:tentative="1">
+      <w:start w:val="1"/>
+      <w:numFmt w:val="bullet"/>
+      <w:lvlText w:val=""/>
+      <w:lvlJc w:val="left"/>
+      <w:pPr>
+        <w:tabs>
+          <w:tab w:val="num" w:pos="5760"/>
+        </w:tabs>
+        <w:ind w:left="5760" w:hanging="360"/>
+      </w:pPr>
+      <w:rPr>
+        <w:rFonts w:ascii="Wingdings" w:hAnsi="Wingdings" w:hint="default"/>
+        <w:sz w:val="20"/>
+      </w:rPr>
+    </w:lvl>
+    <w:lvl w:ilvl="8" w:tentative="1">
+      <w:start w:val="1"/>
+      <w:numFmt w:val="bullet"/>
+      <w:lvlText w:val=""/>
+      <w:lvlJc w:val="left"/>
+      <w:pPr>
+        <w:tabs>
+          <w:tab w:val="num" w:pos="6480"/>
+        </w:tabs>
+        <w:ind w:left="6480" w:hanging="360"/>
+      </w:pPr>
+      <w:rPr>
+        <w:rFonts w:ascii="Wingdings" w:hAnsi="Wingdings" w:hint="default"/>
+        <w:sz w:val="20"/>
+      </w:rPr>
+    </w:lvl>
+  </w:abstractNum>
+  <w:abstractNum w:abstractNumId="7" w15:restartNumberingAfterBreak="0">
     <w:nsid w:val="567936F9"/>
     <w:multiLevelType w:val="multilevel"/>
     <w:tmpl w:val="4446AAB4"/>
@@ -2865,7 +6043,7 @@
       </w:rPr>
     </w:lvl>
   </w:abstractNum>
-  <w:abstractNum w:abstractNumId="4" w15:restartNumberingAfterBreak="0">
+  <w:abstractNum w:abstractNumId="8" w15:restartNumberingAfterBreak="0">
     <w:nsid w:val="58575B75"/>
     <w:multiLevelType w:val="multilevel"/>
     <w:tmpl w:val="D1568ACA"/>
@@ -3015,19 +6193,31 @@
     </w:lvl>
   </w:abstractNum>
   <w:num w:numId="1" w16cid:durableId="490487340">
-    <w:abstractNumId w:val="3"/>
+    <w:abstractNumId w:val="7"/>
   </w:num>
   <w:num w:numId="2" w16cid:durableId="1913272450">
-    <w:abstractNumId w:val="4"/>
+    <w:abstractNumId w:val="8"/>
   </w:num>
   <w:num w:numId="3" w16cid:durableId="688718240">
-    <w:abstractNumId w:val="2"/>
+    <w:abstractNumId w:val="4"/>
   </w:num>
   <w:num w:numId="4" w16cid:durableId="1648968728">
     <w:abstractNumId w:val="0"/>
   </w:num>
   <w:num w:numId="5" w16cid:durableId="1028795985">
+    <w:abstractNumId w:val="3"/>
+  </w:num>
+  <w:num w:numId="6" w16cid:durableId="2082605473">
+    <w:abstractNumId w:val="5"/>
+  </w:num>
+  <w:num w:numId="7" w16cid:durableId="1078210759">
+    <w:abstractNumId w:val="6"/>
+  </w:num>
+  <w:num w:numId="8" w16cid:durableId="1758667614">
     <w:abstractNumId w:val="1"/>
+  </w:num>
+  <w:num w:numId="9" w16cid:durableId="109781556">
+    <w:abstractNumId w:val="2"/>
   </w:num>
 </w:numbering>
 </file>

</xml_diff>

<commit_message>
learn about the types of dbms and data abstraction
</commit_message>
<xml_diff>
--- a/DBMS/DBMS NOTES.docx
+++ b/DBMS/DBMS NOTES.docx
@@ -4852,6 +4852,1713 @@
       <w:r>
         <w:pict w14:anchorId="1BE56C4A">
           <v:rect id="_x0000_i1054" style="width:0;height:1.5pt" o:hralign="center" o:bullet="t" o:hrstd="t" o:hr="t" fillcolor="#a0a0a0" stroked="f"/>
+        </w:pict>
+      </w:r>
+    </w:p>
+    <w:p>
+      <w:pPr>
+        <w:rPr>
+          <w:b/>
+          <w:bCs/>
+          <w:sz w:val="40"/>
+          <w:szCs w:val="40"/>
+          <w:u w:val="single"/>
+        </w:rPr>
+      </w:pPr>
+    </w:p>
+    <w:p>
+      <w:pPr>
+        <w:rPr>
+          <w:b/>
+          <w:bCs/>
+          <w:sz w:val="28"/>
+          <w:szCs w:val="28"/>
+          <w:u w:val="single"/>
+        </w:rPr>
+      </w:pPr>
+      <w:r>
+        <w:rPr>
+          <w:b/>
+          <w:bCs/>
+          <w:sz w:val="40"/>
+          <w:szCs w:val="40"/>
+          <w:u w:val="single"/>
+        </w:rPr>
+        <w:lastRenderedPageBreak/>
+        <w:t xml:space="preserve">DBMS NOTES (PART </w:t>
+      </w:r>
+      <w:r>
+        <w:rPr>
+          <w:b/>
+          <w:bCs/>
+          <w:sz w:val="40"/>
+          <w:szCs w:val="40"/>
+          <w:u w:val="single"/>
+        </w:rPr>
+        <w:t>4</w:t>
+      </w:r>
+      <w:r>
+        <w:rPr>
+          <w:b/>
+          <w:bCs/>
+          <w:sz w:val="40"/>
+          <w:szCs w:val="40"/>
+          <w:u w:val="single"/>
+        </w:rPr>
+        <w:t>)</w:t>
+      </w:r>
+    </w:p>
+    <w:p>
+      <w:pPr>
+        <w:rPr>
+          <w:b/>
+          <w:bCs/>
+        </w:rPr>
+      </w:pPr>
+      <w:r>
+        <w:rPr>
+          <w:b/>
+          <w:bCs/>
+        </w:rPr>
+        <w:t>Data Abstraction Kya Hai?</w:t>
+      </w:r>
+    </w:p>
+    <w:p>
+      <w:r>
+        <w:t xml:space="preserve">"Abstraction" ka simple </w:t>
+      </w:r>
+      <w:proofErr w:type="spellStart"/>
+      <w:r>
+        <w:t>matlab</w:t>
+      </w:r>
+      <w:proofErr w:type="spellEnd"/>
+      <w:r>
+        <w:t xml:space="preserve"> </w:t>
+      </w:r>
+      <w:proofErr w:type="spellStart"/>
+      <w:r>
+        <w:t>hota</w:t>
+      </w:r>
+      <w:proofErr w:type="spellEnd"/>
+      <w:r>
+        <w:t xml:space="preserve"> </w:t>
+      </w:r>
+      <w:proofErr w:type="spellStart"/>
+      <w:r>
+        <w:t>hai</w:t>
+      </w:r>
+      <w:proofErr w:type="spellEnd"/>
+      <w:r>
+        <w:t xml:space="preserve"> </w:t>
+      </w:r>
+      <w:r>
+        <w:rPr>
+          <w:b/>
+          <w:bCs/>
+        </w:rPr>
+        <w:t xml:space="preserve">"Kuch </w:t>
+      </w:r>
+      <w:proofErr w:type="spellStart"/>
+      <w:r>
+        <w:rPr>
+          <w:b/>
+          <w:bCs/>
+        </w:rPr>
+        <w:t>chupa</w:t>
+      </w:r>
+      <w:proofErr w:type="spellEnd"/>
+      <w:r>
+        <w:rPr>
+          <w:b/>
+          <w:bCs/>
+        </w:rPr>
+        <w:t xml:space="preserve"> </w:t>
+      </w:r>
+      <w:proofErr w:type="spellStart"/>
+      <w:r>
+        <w:rPr>
+          <w:b/>
+          <w:bCs/>
+        </w:rPr>
+        <w:t>lena</w:t>
+      </w:r>
+      <w:proofErr w:type="spellEnd"/>
+      <w:r>
+        <w:rPr>
+          <w:b/>
+          <w:bCs/>
+        </w:rPr>
+        <w:t>"</w:t>
+      </w:r>
+      <w:r>
+        <w:t xml:space="preserve">. DBMS </w:t>
+      </w:r>
+      <w:proofErr w:type="spellStart"/>
+      <w:r>
+        <w:t>mein</w:t>
+      </w:r>
+      <w:proofErr w:type="spellEnd"/>
+      <w:r>
+        <w:t xml:space="preserve">, hum user se </w:t>
+      </w:r>
+      <w:proofErr w:type="spellStart"/>
+      <w:r>
+        <w:t>woh</w:t>
+      </w:r>
+      <w:proofErr w:type="spellEnd"/>
+      <w:r>
+        <w:t xml:space="preserve"> unnecessary details </w:t>
+      </w:r>
+      <w:proofErr w:type="spellStart"/>
+      <w:r>
+        <w:t>chupa</w:t>
+      </w:r>
+      <w:proofErr w:type="spellEnd"/>
+      <w:r>
+        <w:t xml:space="preserve"> </w:t>
+      </w:r>
+      <w:proofErr w:type="spellStart"/>
+      <w:r>
+        <w:t>lete</w:t>
+      </w:r>
+      <w:proofErr w:type="spellEnd"/>
+      <w:r>
+        <w:t xml:space="preserve"> hain jo </w:t>
+      </w:r>
+      <w:proofErr w:type="spellStart"/>
+      <w:r>
+        <w:t>unke</w:t>
+      </w:r>
+      <w:proofErr w:type="spellEnd"/>
+      <w:r>
+        <w:t xml:space="preserve"> </w:t>
+      </w:r>
+      <w:proofErr w:type="spellStart"/>
+      <w:r>
+        <w:t>liye</w:t>
+      </w:r>
+      <w:proofErr w:type="spellEnd"/>
+      <w:r>
+        <w:t xml:space="preserve"> </w:t>
+      </w:r>
+      <w:proofErr w:type="spellStart"/>
+      <w:r>
+        <w:t>kaam</w:t>
+      </w:r>
+      <w:proofErr w:type="spellEnd"/>
+      <w:r>
+        <w:t xml:space="preserve"> ki </w:t>
+      </w:r>
+      <w:proofErr w:type="spellStart"/>
+      <w:r>
+        <w:t>nahi</w:t>
+      </w:r>
+      <w:proofErr w:type="spellEnd"/>
+      <w:r>
+        <w:t xml:space="preserve"> hain. User </w:t>
+      </w:r>
+      <w:proofErr w:type="spellStart"/>
+      <w:r>
+        <w:t>sirf</w:t>
+      </w:r>
+      <w:proofErr w:type="spellEnd"/>
+      <w:r>
+        <w:t xml:space="preserve"> </w:t>
+      </w:r>
+      <w:proofErr w:type="spellStart"/>
+      <w:r>
+        <w:t>utna</w:t>
+      </w:r>
+      <w:proofErr w:type="spellEnd"/>
+      <w:r>
+        <w:t xml:space="preserve"> hi </w:t>
+      </w:r>
+      <w:proofErr w:type="spellStart"/>
+      <w:r>
+        <w:t>dekhta</w:t>
+      </w:r>
+      <w:proofErr w:type="spellEnd"/>
+      <w:r>
+        <w:t xml:space="preserve"> </w:t>
+      </w:r>
+      <w:proofErr w:type="spellStart"/>
+      <w:r>
+        <w:t>hai</w:t>
+      </w:r>
+      <w:proofErr w:type="spellEnd"/>
+      <w:r>
+        <w:t xml:space="preserve"> </w:t>
+      </w:r>
+      <w:proofErr w:type="spellStart"/>
+      <w:r>
+        <w:t>jitna</w:t>
+      </w:r>
+      <w:proofErr w:type="spellEnd"/>
+      <w:r>
+        <w:t xml:space="preserve"> </w:t>
+      </w:r>
+      <w:proofErr w:type="spellStart"/>
+      <w:r>
+        <w:t>usse</w:t>
+      </w:r>
+      <w:proofErr w:type="spellEnd"/>
+      <w:r>
+        <w:t xml:space="preserve"> </w:t>
+      </w:r>
+      <w:proofErr w:type="spellStart"/>
+      <w:r>
+        <w:t>zaroorat</w:t>
+      </w:r>
+      <w:proofErr w:type="spellEnd"/>
+      <w:r>
+        <w:t xml:space="preserve"> </w:t>
+      </w:r>
+      <w:proofErr w:type="spellStart"/>
+      <w:r>
+        <w:t>hai</w:t>
+      </w:r>
+      <w:proofErr w:type="spellEnd"/>
+      <w:r>
+        <w:t xml:space="preserve">, aur </w:t>
+      </w:r>
+      <w:proofErr w:type="spellStart"/>
+      <w:r>
+        <w:t>baaki</w:t>
+      </w:r>
+      <w:proofErr w:type="spellEnd"/>
+      <w:r>
+        <w:t xml:space="preserve"> ki complex internal details (</w:t>
+      </w:r>
+      <w:proofErr w:type="spellStart"/>
+      <w:r>
+        <w:t>jaise</w:t>
+      </w:r>
+      <w:proofErr w:type="spellEnd"/>
+      <w:r>
+        <w:t xml:space="preserve"> data </w:t>
+      </w:r>
+      <w:proofErr w:type="spellStart"/>
+      <w:r>
+        <w:t>kahan</w:t>
+      </w:r>
+      <w:proofErr w:type="spellEnd"/>
+      <w:r>
+        <w:t xml:space="preserve"> aur </w:t>
+      </w:r>
+      <w:proofErr w:type="spellStart"/>
+      <w:r>
+        <w:t>kaise</w:t>
+      </w:r>
+      <w:proofErr w:type="spellEnd"/>
+      <w:r>
+        <w:t xml:space="preserve"> store </w:t>
+      </w:r>
+      <w:proofErr w:type="spellStart"/>
+      <w:r>
+        <w:t>ho</w:t>
+      </w:r>
+      <w:proofErr w:type="spellEnd"/>
+      <w:r>
+        <w:t xml:space="preserve"> </w:t>
+      </w:r>
+      <w:proofErr w:type="spellStart"/>
+      <w:r>
+        <w:t>raha</w:t>
+      </w:r>
+      <w:proofErr w:type="spellEnd"/>
+      <w:r>
+        <w:t xml:space="preserve"> </w:t>
+      </w:r>
+      <w:proofErr w:type="spellStart"/>
+      <w:r>
+        <w:t>hai</w:t>
+      </w:r>
+      <w:proofErr w:type="spellEnd"/>
+      <w:r>
+        <w:t xml:space="preserve">) hide </w:t>
+      </w:r>
+      <w:proofErr w:type="spellStart"/>
+      <w:r>
+        <w:t>kar</w:t>
+      </w:r>
+      <w:proofErr w:type="spellEnd"/>
+      <w:r>
+        <w:t xml:space="preserve"> di </w:t>
+      </w:r>
+      <w:proofErr w:type="spellStart"/>
+      <w:r>
+        <w:t>jaati</w:t>
+      </w:r>
+      <w:proofErr w:type="spellEnd"/>
+      <w:r>
+        <w:t xml:space="preserve"> hain.</w:t>
+      </w:r>
+    </w:p>
+    <w:p>
+      <w:pPr>
+        <w:rPr>
+          <w:b/>
+          <w:bCs/>
+        </w:rPr>
+      </w:pPr>
+      <w:r>
+        <w:rPr>
+          <w:b/>
+          <w:bCs/>
+        </w:rPr>
+        <w:t>Levels of Data Abstraction</w:t>
+      </w:r>
+    </w:p>
+    <w:p>
+      <w:r>
+        <w:t xml:space="preserve">Isse hum "Three-Level Architecture" </w:t>
+      </w:r>
+      <w:proofErr w:type="spellStart"/>
+      <w:r>
+        <w:t>bhi</w:t>
+      </w:r>
+      <w:proofErr w:type="spellEnd"/>
+      <w:r>
+        <w:t xml:space="preserve"> </w:t>
+      </w:r>
+      <w:proofErr w:type="spellStart"/>
+      <w:r>
+        <w:t>kehte</w:t>
+      </w:r>
+      <w:proofErr w:type="spellEnd"/>
+      <w:r>
+        <w:t xml:space="preserve"> hain. Ye levels complexity ko manage </w:t>
+      </w:r>
+      <w:proofErr w:type="spellStart"/>
+      <w:r>
+        <w:t>karne</w:t>
+      </w:r>
+      <w:proofErr w:type="spellEnd"/>
+      <w:r>
+        <w:t xml:space="preserve"> </w:t>
+      </w:r>
+      <w:proofErr w:type="spellStart"/>
+      <w:r>
+        <w:t>mein</w:t>
+      </w:r>
+      <w:proofErr w:type="spellEnd"/>
+      <w:r>
+        <w:t xml:space="preserve"> help </w:t>
+      </w:r>
+      <w:proofErr w:type="spellStart"/>
+      <w:r>
+        <w:t>karte</w:t>
+      </w:r>
+      <w:proofErr w:type="spellEnd"/>
+      <w:r>
+        <w:t xml:space="preserve"> hain:</w:t>
+      </w:r>
+    </w:p>
+    <w:p>
+      <w:pPr>
+        <w:rPr>
+          <w:b/>
+          <w:bCs/>
+        </w:rPr>
+      </w:pPr>
+      <w:r>
+        <w:rPr>
+          <w:b/>
+          <w:bCs/>
+        </w:rPr>
+        <w:t>1. Physical Level (Lowest Level)</w:t>
+      </w:r>
+    </w:p>
+    <w:p>
+      <w:r>
+        <w:t xml:space="preserve">Yeh </w:t>
+      </w:r>
+      <w:proofErr w:type="spellStart"/>
+      <w:r>
+        <w:t>sabse</w:t>
+      </w:r>
+      <w:proofErr w:type="spellEnd"/>
+      <w:r>
+        <w:t xml:space="preserve"> </w:t>
+      </w:r>
+      <w:proofErr w:type="spellStart"/>
+      <w:r>
+        <w:t>neeche</w:t>
+      </w:r>
+      <w:proofErr w:type="spellEnd"/>
+      <w:r>
+        <w:t xml:space="preserve"> ka level </w:t>
+      </w:r>
+      <w:proofErr w:type="spellStart"/>
+      <w:r>
+        <w:t>hai</w:t>
+      </w:r>
+      <w:proofErr w:type="spellEnd"/>
+      <w:r>
+        <w:t>.</w:t>
+      </w:r>
+    </w:p>
+    <w:p>
+      <w:pPr>
+        <w:numPr>
+          <w:ilvl w:val="0"/>
+          <w:numId w:val="10"/>
+        </w:numPr>
+      </w:pPr>
+      <w:r>
+        <w:rPr>
+          <w:b/>
+          <w:bCs/>
+        </w:rPr>
+        <w:t xml:space="preserve">Kya </w:t>
+      </w:r>
+      <w:proofErr w:type="spellStart"/>
+      <w:r>
+        <w:rPr>
+          <w:b/>
+          <w:bCs/>
+        </w:rPr>
+        <w:t>hota</w:t>
+      </w:r>
+      <w:proofErr w:type="spellEnd"/>
+      <w:r>
+        <w:rPr>
+          <w:b/>
+          <w:bCs/>
+        </w:rPr>
+        <w:t xml:space="preserve"> </w:t>
+      </w:r>
+      <w:proofErr w:type="spellStart"/>
+      <w:r>
+        <w:rPr>
+          <w:b/>
+          <w:bCs/>
+        </w:rPr>
+        <w:t>hai</w:t>
+      </w:r>
+      <w:proofErr w:type="spellEnd"/>
+      <w:r>
+        <w:rPr>
+          <w:b/>
+          <w:bCs/>
+        </w:rPr>
+        <w:t>:</w:t>
+      </w:r>
+      <w:r>
+        <w:t xml:space="preserve"> Yahan decide </w:t>
+      </w:r>
+      <w:proofErr w:type="spellStart"/>
+      <w:r>
+        <w:t>hota</w:t>
+      </w:r>
+      <w:proofErr w:type="spellEnd"/>
+      <w:r>
+        <w:t xml:space="preserve"> </w:t>
+      </w:r>
+      <w:proofErr w:type="spellStart"/>
+      <w:r>
+        <w:t>hai</w:t>
+      </w:r>
+      <w:proofErr w:type="spellEnd"/>
+      <w:r>
+        <w:t xml:space="preserve"> ki </w:t>
+      </w:r>
+      <w:r>
+        <w:rPr>
+          <w:b/>
+          <w:bCs/>
+        </w:rPr>
+        <w:t xml:space="preserve">"Data physically </w:t>
+      </w:r>
+      <w:proofErr w:type="spellStart"/>
+      <w:r>
+        <w:rPr>
+          <w:b/>
+          <w:bCs/>
+        </w:rPr>
+        <w:t>kaise</w:t>
+      </w:r>
+      <w:proofErr w:type="spellEnd"/>
+      <w:r>
+        <w:rPr>
+          <w:b/>
+          <w:bCs/>
+        </w:rPr>
+        <w:t xml:space="preserve"> store </w:t>
+      </w:r>
+      <w:proofErr w:type="spellStart"/>
+      <w:r>
+        <w:rPr>
+          <w:b/>
+          <w:bCs/>
+        </w:rPr>
+        <w:t>ho</w:t>
+      </w:r>
+      <w:proofErr w:type="spellEnd"/>
+      <w:r>
+        <w:rPr>
+          <w:b/>
+          <w:bCs/>
+        </w:rPr>
+        <w:t xml:space="preserve"> </w:t>
+      </w:r>
+      <w:proofErr w:type="spellStart"/>
+      <w:r>
+        <w:rPr>
+          <w:b/>
+          <w:bCs/>
+        </w:rPr>
+        <w:t>raha</w:t>
+      </w:r>
+      <w:proofErr w:type="spellEnd"/>
+      <w:r>
+        <w:rPr>
+          <w:b/>
+          <w:bCs/>
+        </w:rPr>
+        <w:t xml:space="preserve"> </w:t>
+      </w:r>
+      <w:proofErr w:type="spellStart"/>
+      <w:r>
+        <w:rPr>
+          <w:b/>
+          <w:bCs/>
+        </w:rPr>
+        <w:t>hai</w:t>
+      </w:r>
+      <w:proofErr w:type="spellEnd"/>
+      <w:r>
+        <w:rPr>
+          <w:b/>
+          <w:bCs/>
+        </w:rPr>
+        <w:t>?"</w:t>
+      </w:r>
+    </w:p>
+    <w:p>
+      <w:pPr>
+        <w:numPr>
+          <w:ilvl w:val="0"/>
+          <w:numId w:val="10"/>
+        </w:numPr>
+      </w:pPr>
+      <w:r>
+        <w:rPr>
+          <w:b/>
+          <w:bCs/>
+        </w:rPr>
+        <w:t>Details:</w:t>
+      </w:r>
+      <w:r>
+        <w:t xml:space="preserve"> Data disk </w:t>
+      </w:r>
+      <w:proofErr w:type="spellStart"/>
+      <w:r>
+        <w:t>ke</w:t>
+      </w:r>
+      <w:proofErr w:type="spellEnd"/>
+      <w:r>
+        <w:t xml:space="preserve"> </w:t>
+      </w:r>
+      <w:proofErr w:type="spellStart"/>
+      <w:r>
+        <w:t>kaun</w:t>
+      </w:r>
+      <w:proofErr w:type="spellEnd"/>
+      <w:r>
+        <w:t xml:space="preserve"> se memory location pe </w:t>
+      </w:r>
+      <w:proofErr w:type="spellStart"/>
+      <w:r>
+        <w:t>hai</w:t>
+      </w:r>
+      <w:proofErr w:type="spellEnd"/>
+      <w:r>
+        <w:t xml:space="preserve">? Kaun </w:t>
+      </w:r>
+      <w:proofErr w:type="spellStart"/>
+      <w:r>
+        <w:t>sa</w:t>
+      </w:r>
+      <w:proofErr w:type="spellEnd"/>
+      <w:r>
+        <w:t xml:space="preserve"> data structure (B-Trees, Hashing) </w:t>
+      </w:r>
+      <w:proofErr w:type="gramStart"/>
+      <w:r>
+        <w:t>use</w:t>
+      </w:r>
+      <w:proofErr w:type="gramEnd"/>
+      <w:r>
+        <w:t xml:space="preserve"> </w:t>
+      </w:r>
+      <w:proofErr w:type="spellStart"/>
+      <w:r>
+        <w:t>ho</w:t>
+      </w:r>
+      <w:proofErr w:type="spellEnd"/>
+      <w:r>
+        <w:t xml:space="preserve"> </w:t>
+      </w:r>
+      <w:proofErr w:type="spellStart"/>
+      <w:r>
+        <w:t>raha</w:t>
+      </w:r>
+      <w:proofErr w:type="spellEnd"/>
+      <w:r>
+        <w:t xml:space="preserve"> </w:t>
+      </w:r>
+      <w:proofErr w:type="spellStart"/>
+      <w:r>
+        <w:t>hai</w:t>
+      </w:r>
+      <w:proofErr w:type="spellEnd"/>
+      <w:r>
+        <w:t>?</w:t>
+      </w:r>
+    </w:p>
+    <w:p>
+      <w:pPr>
+        <w:numPr>
+          <w:ilvl w:val="0"/>
+          <w:numId w:val="10"/>
+        </w:numPr>
+      </w:pPr>
+      <w:proofErr w:type="spellStart"/>
+      <w:r>
+        <w:rPr>
+          <w:b/>
+          <w:bCs/>
+        </w:rPr>
+        <w:t>Kiske</w:t>
+      </w:r>
+      <w:proofErr w:type="spellEnd"/>
+      <w:r>
+        <w:rPr>
+          <w:b/>
+          <w:bCs/>
+        </w:rPr>
+        <w:t xml:space="preserve"> </w:t>
+      </w:r>
+      <w:proofErr w:type="spellStart"/>
+      <w:r>
+        <w:rPr>
+          <w:b/>
+          <w:bCs/>
+        </w:rPr>
+        <w:t>liye</w:t>
+      </w:r>
+      <w:proofErr w:type="spellEnd"/>
+      <w:r>
+        <w:rPr>
+          <w:b/>
+          <w:bCs/>
+        </w:rPr>
+        <w:t>:</w:t>
+      </w:r>
+      <w:r>
+        <w:t xml:space="preserve"> Ye database designers aur developers </w:t>
+      </w:r>
+      <w:proofErr w:type="spellStart"/>
+      <w:r>
+        <w:t>ke</w:t>
+      </w:r>
+      <w:proofErr w:type="spellEnd"/>
+      <w:r>
+        <w:t xml:space="preserve"> </w:t>
+      </w:r>
+      <w:proofErr w:type="spellStart"/>
+      <w:r>
+        <w:t>liye</w:t>
+      </w:r>
+      <w:proofErr w:type="spellEnd"/>
+      <w:r>
+        <w:t xml:space="preserve"> </w:t>
+      </w:r>
+      <w:proofErr w:type="spellStart"/>
+      <w:r>
+        <w:t>hota</w:t>
+      </w:r>
+      <w:proofErr w:type="spellEnd"/>
+      <w:r>
+        <w:t xml:space="preserve"> </w:t>
+      </w:r>
+      <w:proofErr w:type="spellStart"/>
+      <w:r>
+        <w:t>hai</w:t>
+      </w:r>
+      <w:proofErr w:type="spellEnd"/>
+      <w:r>
+        <w:t xml:space="preserve"> jo performance optimize </w:t>
+      </w:r>
+      <w:proofErr w:type="spellStart"/>
+      <w:r>
+        <w:t>karte</w:t>
+      </w:r>
+      <w:proofErr w:type="spellEnd"/>
+      <w:r>
+        <w:t xml:space="preserve"> hain. User ko </w:t>
+      </w:r>
+      <w:proofErr w:type="spellStart"/>
+      <w:r>
+        <w:t>isse</w:t>
+      </w:r>
+      <w:proofErr w:type="spellEnd"/>
+      <w:r>
+        <w:t xml:space="preserve"> koi </w:t>
+      </w:r>
+      <w:proofErr w:type="spellStart"/>
+      <w:r>
+        <w:t>matlab</w:t>
+      </w:r>
+      <w:proofErr w:type="spellEnd"/>
+      <w:r>
+        <w:t xml:space="preserve"> </w:t>
+      </w:r>
+      <w:proofErr w:type="spellStart"/>
+      <w:r>
+        <w:t>nahi</w:t>
+      </w:r>
+      <w:proofErr w:type="spellEnd"/>
+      <w:r>
+        <w:t xml:space="preserve"> </w:t>
+      </w:r>
+      <w:proofErr w:type="spellStart"/>
+      <w:r>
+        <w:t>hota</w:t>
+      </w:r>
+      <w:proofErr w:type="spellEnd"/>
+      <w:r>
+        <w:t>.</w:t>
+      </w:r>
+    </w:p>
+    <w:p>
+      <w:pPr>
+        <w:rPr>
+          <w:b/>
+          <w:bCs/>
+        </w:rPr>
+      </w:pPr>
+      <w:r>
+        <w:rPr>
+          <w:b/>
+          <w:bCs/>
+        </w:rPr>
+        <w:t>2. Logical Level (Middle Level)</w:t>
+      </w:r>
+    </w:p>
+    <w:p>
+      <w:r>
+        <w:t xml:space="preserve">Yeh levels </w:t>
+      </w:r>
+      <w:proofErr w:type="spellStart"/>
+      <w:r>
+        <w:t>ke</w:t>
+      </w:r>
+      <w:proofErr w:type="spellEnd"/>
+      <w:r>
+        <w:t xml:space="preserve"> beech ka bridge </w:t>
+      </w:r>
+      <w:proofErr w:type="spellStart"/>
+      <w:r>
+        <w:t>hai</w:t>
+      </w:r>
+      <w:proofErr w:type="spellEnd"/>
+      <w:r>
+        <w:t>.</w:t>
+      </w:r>
+    </w:p>
+    <w:p>
+      <w:pPr>
+        <w:numPr>
+          <w:ilvl w:val="0"/>
+          <w:numId w:val="11"/>
+        </w:numPr>
+      </w:pPr>
+      <w:r>
+        <w:rPr>
+          <w:b/>
+          <w:bCs/>
+        </w:rPr>
+        <w:t xml:space="preserve">Kya </w:t>
+      </w:r>
+      <w:proofErr w:type="spellStart"/>
+      <w:r>
+        <w:rPr>
+          <w:b/>
+          <w:bCs/>
+        </w:rPr>
+        <w:t>hota</w:t>
+      </w:r>
+      <w:proofErr w:type="spellEnd"/>
+      <w:r>
+        <w:rPr>
+          <w:b/>
+          <w:bCs/>
+        </w:rPr>
+        <w:t xml:space="preserve"> </w:t>
+      </w:r>
+      <w:proofErr w:type="spellStart"/>
+      <w:r>
+        <w:rPr>
+          <w:b/>
+          <w:bCs/>
+        </w:rPr>
+        <w:t>hai</w:t>
+      </w:r>
+      <w:proofErr w:type="spellEnd"/>
+      <w:r>
+        <w:rPr>
+          <w:b/>
+          <w:bCs/>
+        </w:rPr>
+        <w:t>:</w:t>
+      </w:r>
+      <w:r>
+        <w:t xml:space="preserve"> Yahan decide </w:t>
+      </w:r>
+      <w:proofErr w:type="spellStart"/>
+      <w:r>
+        <w:t>hota</w:t>
+      </w:r>
+      <w:proofErr w:type="spellEnd"/>
+      <w:r>
+        <w:t xml:space="preserve"> </w:t>
+      </w:r>
+      <w:proofErr w:type="spellStart"/>
+      <w:r>
+        <w:t>hai</w:t>
+      </w:r>
+      <w:proofErr w:type="spellEnd"/>
+      <w:r>
+        <w:t xml:space="preserve"> ki </w:t>
+      </w:r>
+      <w:r>
+        <w:rPr>
+          <w:b/>
+          <w:bCs/>
+        </w:rPr>
+        <w:t xml:space="preserve">"Database </w:t>
+      </w:r>
+      <w:proofErr w:type="spellStart"/>
+      <w:r>
+        <w:rPr>
+          <w:b/>
+          <w:bCs/>
+        </w:rPr>
+        <w:t>mein</w:t>
+      </w:r>
+      <w:proofErr w:type="spellEnd"/>
+      <w:r>
+        <w:rPr>
+          <w:b/>
+          <w:bCs/>
+        </w:rPr>
+        <w:t xml:space="preserve"> </w:t>
+      </w:r>
+      <w:proofErr w:type="spellStart"/>
+      <w:r>
+        <w:rPr>
+          <w:b/>
+          <w:bCs/>
+        </w:rPr>
+        <w:t>kya</w:t>
+      </w:r>
+      <w:proofErr w:type="spellEnd"/>
+      <w:r>
+        <w:rPr>
+          <w:b/>
+          <w:bCs/>
+        </w:rPr>
+        <w:t xml:space="preserve"> data store </w:t>
+      </w:r>
+      <w:proofErr w:type="spellStart"/>
+      <w:r>
+        <w:rPr>
+          <w:b/>
+          <w:bCs/>
+        </w:rPr>
+        <w:t>ho</w:t>
+      </w:r>
+      <w:proofErr w:type="spellEnd"/>
+      <w:r>
+        <w:rPr>
+          <w:b/>
+          <w:bCs/>
+        </w:rPr>
+        <w:t xml:space="preserve"> </w:t>
+      </w:r>
+      <w:proofErr w:type="spellStart"/>
+      <w:r>
+        <w:rPr>
+          <w:b/>
+          <w:bCs/>
+        </w:rPr>
+        <w:t>raha</w:t>
+      </w:r>
+      <w:proofErr w:type="spellEnd"/>
+      <w:r>
+        <w:rPr>
+          <w:b/>
+          <w:bCs/>
+        </w:rPr>
+        <w:t xml:space="preserve"> </w:t>
+      </w:r>
+      <w:proofErr w:type="spellStart"/>
+      <w:r>
+        <w:rPr>
+          <w:b/>
+          <w:bCs/>
+        </w:rPr>
+        <w:t>hai</w:t>
+      </w:r>
+      <w:proofErr w:type="spellEnd"/>
+      <w:r>
+        <w:rPr>
+          <w:b/>
+          <w:bCs/>
+        </w:rPr>
+        <w:t>?"</w:t>
+      </w:r>
+      <w:r>
+        <w:t xml:space="preserve"> aur </w:t>
+      </w:r>
+      <w:proofErr w:type="spellStart"/>
+      <w:r>
+        <w:t>unka</w:t>
+      </w:r>
+      <w:proofErr w:type="spellEnd"/>
+      <w:r>
+        <w:t xml:space="preserve"> </w:t>
+      </w:r>
+      <w:proofErr w:type="spellStart"/>
+      <w:r>
+        <w:t>aapas</w:t>
+      </w:r>
+      <w:proofErr w:type="spellEnd"/>
+      <w:r>
+        <w:t xml:space="preserve"> </w:t>
+      </w:r>
+      <w:proofErr w:type="spellStart"/>
+      <w:r>
+        <w:t>mein</w:t>
+      </w:r>
+      <w:proofErr w:type="spellEnd"/>
+      <w:r>
+        <w:t xml:space="preserve"> </w:t>
+      </w:r>
+      <w:r>
+        <w:rPr>
+          <w:b/>
+          <w:bCs/>
+        </w:rPr>
+        <w:t xml:space="preserve">"Relation </w:t>
+      </w:r>
+      <w:proofErr w:type="spellStart"/>
+      <w:r>
+        <w:rPr>
+          <w:b/>
+          <w:bCs/>
+        </w:rPr>
+        <w:t>kya</w:t>
+      </w:r>
+      <w:proofErr w:type="spellEnd"/>
+      <w:r>
+        <w:rPr>
+          <w:b/>
+          <w:bCs/>
+        </w:rPr>
+        <w:t xml:space="preserve"> </w:t>
+      </w:r>
+      <w:proofErr w:type="spellStart"/>
+      <w:r>
+        <w:rPr>
+          <w:b/>
+          <w:bCs/>
+        </w:rPr>
+        <w:t>hai</w:t>
+      </w:r>
+      <w:proofErr w:type="spellEnd"/>
+      <w:r>
+        <w:rPr>
+          <w:b/>
+          <w:bCs/>
+        </w:rPr>
+        <w:t>?"</w:t>
+      </w:r>
+    </w:p>
+    <w:p>
+      <w:pPr>
+        <w:numPr>
+          <w:ilvl w:val="0"/>
+          <w:numId w:val="11"/>
+        </w:numPr>
+      </w:pPr>
+      <w:r>
+        <w:rPr>
+          <w:b/>
+          <w:bCs/>
+        </w:rPr>
+        <w:t>Details:</w:t>
+      </w:r>
+      <w:r>
+        <w:t xml:space="preserve"> Table create </w:t>
+      </w:r>
+      <w:proofErr w:type="spellStart"/>
+      <w:r>
+        <w:t>karna</w:t>
+      </w:r>
+      <w:proofErr w:type="spellEnd"/>
+      <w:r>
+        <w:t xml:space="preserve">, columns (attributes) aur rows (tuples) define </w:t>
+      </w:r>
+      <w:proofErr w:type="spellStart"/>
+      <w:r>
+        <w:t>karna</w:t>
+      </w:r>
+      <w:proofErr w:type="spellEnd"/>
+      <w:r>
+        <w:t xml:space="preserve">, aur </w:t>
+      </w:r>
+      <w:proofErr w:type="spellStart"/>
+      <w:r>
+        <w:t>unke</w:t>
+      </w:r>
+      <w:proofErr w:type="spellEnd"/>
+      <w:r>
+        <w:t xml:space="preserve"> beech relationships set </w:t>
+      </w:r>
+      <w:proofErr w:type="spellStart"/>
+      <w:r>
+        <w:t>karna</w:t>
+      </w:r>
+      <w:proofErr w:type="spellEnd"/>
+      <w:r>
+        <w:t xml:space="preserve"> (</w:t>
+      </w:r>
+      <w:proofErr w:type="spellStart"/>
+      <w:r>
+        <w:t>jaise</w:t>
+      </w:r>
+      <w:proofErr w:type="spellEnd"/>
+      <w:r>
+        <w:t xml:space="preserve"> Student ID ko link </w:t>
+      </w:r>
+      <w:proofErr w:type="spellStart"/>
+      <w:r>
+        <w:t>karna</w:t>
+      </w:r>
+      <w:proofErr w:type="spellEnd"/>
+      <w:r>
+        <w:t>).</w:t>
+      </w:r>
+    </w:p>
+    <w:p>
+      <w:pPr>
+        <w:numPr>
+          <w:ilvl w:val="0"/>
+          <w:numId w:val="11"/>
+        </w:numPr>
+      </w:pPr>
+      <w:r>
+        <w:rPr>
+          <w:b/>
+          <w:bCs/>
+        </w:rPr>
+        <w:t>Constraints:</w:t>
+      </w:r>
+      <w:r>
+        <w:t xml:space="preserve"> Yahan hum rules set </w:t>
+      </w:r>
+      <w:proofErr w:type="spellStart"/>
+      <w:r>
+        <w:t>karte</w:t>
+      </w:r>
+      <w:proofErr w:type="spellEnd"/>
+      <w:r>
+        <w:t xml:space="preserve"> hain, </w:t>
+      </w:r>
+      <w:proofErr w:type="spellStart"/>
+      <w:r>
+        <w:t>jaise</w:t>
+      </w:r>
+      <w:proofErr w:type="spellEnd"/>
+      <w:r>
+        <w:t xml:space="preserve"> </w:t>
+      </w:r>
+      <w:proofErr w:type="spellStart"/>
+      <w:r>
+        <w:t>kisi</w:t>
+      </w:r>
+      <w:proofErr w:type="spellEnd"/>
+      <w:r>
+        <w:t xml:space="preserve"> ID ko unique </w:t>
+      </w:r>
+      <w:proofErr w:type="spellStart"/>
+      <w:r>
+        <w:t>rakhna</w:t>
+      </w:r>
+      <w:proofErr w:type="spellEnd"/>
+      <w:r>
+        <w:t>.</w:t>
+      </w:r>
+    </w:p>
+    <w:p>
+      <w:pPr>
+        <w:rPr>
+          <w:b/>
+          <w:bCs/>
+        </w:rPr>
+      </w:pPr>
+      <w:r>
+        <w:rPr>
+          <w:b/>
+          <w:bCs/>
+        </w:rPr>
+        <w:t>3. View Level (Highest Level)</w:t>
+      </w:r>
+    </w:p>
+    <w:p>
+      <w:r>
+        <w:t xml:space="preserve">Yeh </w:t>
+      </w:r>
+      <w:proofErr w:type="spellStart"/>
+      <w:r>
+        <w:t>sabse</w:t>
+      </w:r>
+      <w:proofErr w:type="spellEnd"/>
+      <w:r>
+        <w:t xml:space="preserve"> </w:t>
+      </w:r>
+      <w:proofErr w:type="spellStart"/>
+      <w:r>
+        <w:t>upar</w:t>
+      </w:r>
+      <w:proofErr w:type="spellEnd"/>
+      <w:r>
+        <w:t xml:space="preserve"> ka level </w:t>
+      </w:r>
+      <w:proofErr w:type="spellStart"/>
+      <w:r>
+        <w:t>hai</w:t>
+      </w:r>
+      <w:proofErr w:type="spellEnd"/>
+      <w:r>
+        <w:t xml:space="preserve">, </w:t>
+      </w:r>
+      <w:proofErr w:type="spellStart"/>
+      <w:r>
+        <w:t>jahan</w:t>
+      </w:r>
+      <w:proofErr w:type="spellEnd"/>
+      <w:r>
+        <w:t xml:space="preserve"> user interact </w:t>
+      </w:r>
+      <w:proofErr w:type="spellStart"/>
+      <w:r>
+        <w:t>karta</w:t>
+      </w:r>
+      <w:proofErr w:type="spellEnd"/>
+      <w:r>
+        <w:t xml:space="preserve"> </w:t>
+      </w:r>
+      <w:proofErr w:type="spellStart"/>
+      <w:r>
+        <w:t>hai</w:t>
+      </w:r>
+      <w:proofErr w:type="spellEnd"/>
+      <w:r>
+        <w:t>.</w:t>
+      </w:r>
+    </w:p>
+    <w:p>
+      <w:pPr>
+        <w:numPr>
+          <w:ilvl w:val="0"/>
+          <w:numId w:val="12"/>
+        </w:numPr>
+      </w:pPr>
+      <w:r>
+        <w:rPr>
+          <w:b/>
+          <w:bCs/>
+        </w:rPr>
+        <w:t xml:space="preserve">Kya </w:t>
+      </w:r>
+      <w:proofErr w:type="spellStart"/>
+      <w:r>
+        <w:rPr>
+          <w:b/>
+          <w:bCs/>
+        </w:rPr>
+        <w:t>hota</w:t>
+      </w:r>
+      <w:proofErr w:type="spellEnd"/>
+      <w:r>
+        <w:rPr>
+          <w:b/>
+          <w:bCs/>
+        </w:rPr>
+        <w:t xml:space="preserve"> </w:t>
+      </w:r>
+      <w:proofErr w:type="spellStart"/>
+      <w:r>
+        <w:rPr>
+          <w:b/>
+          <w:bCs/>
+        </w:rPr>
+        <w:t>hai</w:t>
+      </w:r>
+      <w:proofErr w:type="spellEnd"/>
+      <w:r>
+        <w:rPr>
+          <w:b/>
+          <w:bCs/>
+        </w:rPr>
+        <w:t>:</w:t>
+      </w:r>
+      <w:r>
+        <w:t xml:space="preserve"> </w:t>
+      </w:r>
+      <w:r>
+        <w:rPr>
+          <w:b/>
+          <w:bCs/>
+        </w:rPr>
+        <w:t xml:space="preserve">"User ko </w:t>
+      </w:r>
+      <w:proofErr w:type="spellStart"/>
+      <w:r>
+        <w:rPr>
+          <w:b/>
+          <w:bCs/>
+        </w:rPr>
+        <w:t>kya</w:t>
+      </w:r>
+      <w:proofErr w:type="spellEnd"/>
+      <w:r>
+        <w:rPr>
+          <w:b/>
+          <w:bCs/>
+        </w:rPr>
+        <w:t xml:space="preserve"> </w:t>
+      </w:r>
+      <w:proofErr w:type="spellStart"/>
+      <w:r>
+        <w:rPr>
+          <w:b/>
+          <w:bCs/>
+        </w:rPr>
+        <w:t>dikhna</w:t>
+      </w:r>
+      <w:proofErr w:type="spellEnd"/>
+      <w:r>
+        <w:rPr>
+          <w:b/>
+          <w:bCs/>
+        </w:rPr>
+        <w:t xml:space="preserve"> </w:t>
+      </w:r>
+      <w:proofErr w:type="spellStart"/>
+      <w:r>
+        <w:rPr>
+          <w:b/>
+          <w:bCs/>
+        </w:rPr>
+        <w:t>chahiye</w:t>
+      </w:r>
+      <w:proofErr w:type="spellEnd"/>
+      <w:r>
+        <w:rPr>
+          <w:b/>
+          <w:bCs/>
+        </w:rPr>
+        <w:t>?"</w:t>
+      </w:r>
+    </w:p>
+    <w:p>
+      <w:pPr>
+        <w:numPr>
+          <w:ilvl w:val="0"/>
+          <w:numId w:val="12"/>
+        </w:numPr>
+      </w:pPr>
+      <w:r>
+        <w:rPr>
+          <w:b/>
+          <w:bCs/>
+        </w:rPr>
+        <w:t>Example:</w:t>
+      </w:r>
+    </w:p>
+    <w:p>
+      <w:pPr>
+        <w:numPr>
+          <w:ilvl w:val="1"/>
+          <w:numId w:val="12"/>
+        </w:numPr>
+      </w:pPr>
+      <w:r>
+        <w:rPr>
+          <w:b/>
+          <w:bCs/>
+        </w:rPr>
+        <w:t>Teacher:</w:t>
+      </w:r>
+      <w:r>
+        <w:t xml:space="preserve"> </w:t>
+      </w:r>
+      <w:proofErr w:type="spellStart"/>
+      <w:r>
+        <w:t>Inhe</w:t>
+      </w:r>
+      <w:proofErr w:type="spellEnd"/>
+      <w:r>
+        <w:t xml:space="preserve"> student ka naam, subject, aur roll number </w:t>
+      </w:r>
+      <w:proofErr w:type="spellStart"/>
+      <w:r>
+        <w:t>dikhta</w:t>
+      </w:r>
+      <w:proofErr w:type="spellEnd"/>
+      <w:r>
+        <w:t xml:space="preserve"> </w:t>
+      </w:r>
+      <w:proofErr w:type="spellStart"/>
+      <w:r>
+        <w:t>hai</w:t>
+      </w:r>
+      <w:proofErr w:type="spellEnd"/>
+      <w:r>
+        <w:t>.</w:t>
+      </w:r>
+    </w:p>
+    <w:p>
+      <w:pPr>
+        <w:numPr>
+          <w:ilvl w:val="1"/>
+          <w:numId w:val="12"/>
+        </w:numPr>
+      </w:pPr>
+      <w:r>
+        <w:rPr>
+          <w:b/>
+          <w:bCs/>
+        </w:rPr>
+        <w:t>Accounts Team:</w:t>
+      </w:r>
+      <w:r>
+        <w:t xml:space="preserve"> </w:t>
+      </w:r>
+      <w:proofErr w:type="spellStart"/>
+      <w:r>
+        <w:t>Inhe</w:t>
+      </w:r>
+      <w:proofErr w:type="spellEnd"/>
+      <w:r>
+        <w:t xml:space="preserve"> student ki fee details, payment history, aur pending balance </w:t>
+      </w:r>
+      <w:proofErr w:type="spellStart"/>
+      <w:r>
+        <w:t>dikhta</w:t>
+      </w:r>
+      <w:proofErr w:type="spellEnd"/>
+      <w:r>
+        <w:t xml:space="preserve"> </w:t>
+      </w:r>
+      <w:proofErr w:type="spellStart"/>
+      <w:r>
+        <w:t>hai</w:t>
+      </w:r>
+      <w:proofErr w:type="spellEnd"/>
+      <w:r>
+        <w:t>.</w:t>
+      </w:r>
+    </w:p>
+    <w:p>
+      <w:pPr>
+        <w:numPr>
+          <w:ilvl w:val="1"/>
+          <w:numId w:val="12"/>
+        </w:numPr>
+      </w:pPr>
+      <w:r>
+        <w:rPr>
+          <w:b/>
+          <w:bCs/>
+        </w:rPr>
+        <w:lastRenderedPageBreak/>
+        <w:t>Student:</w:t>
+      </w:r>
+      <w:r>
+        <w:t xml:space="preserve"> </w:t>
+      </w:r>
+      <w:proofErr w:type="spellStart"/>
+      <w:r>
+        <w:t>Inhe</w:t>
+      </w:r>
+      <w:proofErr w:type="spellEnd"/>
+      <w:r>
+        <w:t xml:space="preserve"> </w:t>
+      </w:r>
+      <w:proofErr w:type="spellStart"/>
+      <w:r>
+        <w:t>shayad</w:t>
+      </w:r>
+      <w:proofErr w:type="spellEnd"/>
+      <w:r>
+        <w:t xml:space="preserve"> </w:t>
+      </w:r>
+      <w:proofErr w:type="spellStart"/>
+      <w:r>
+        <w:t>sirf</w:t>
+      </w:r>
+      <w:proofErr w:type="spellEnd"/>
+      <w:r>
+        <w:t xml:space="preserve"> </w:t>
+      </w:r>
+      <w:proofErr w:type="spellStart"/>
+      <w:r>
+        <w:t>apne</w:t>
+      </w:r>
+      <w:proofErr w:type="spellEnd"/>
+      <w:r>
+        <w:t xml:space="preserve"> hi records </w:t>
+      </w:r>
+      <w:proofErr w:type="spellStart"/>
+      <w:r>
+        <w:t>dikhte</w:t>
+      </w:r>
+      <w:proofErr w:type="spellEnd"/>
+      <w:r>
+        <w:t xml:space="preserve"> hain.</w:t>
+      </w:r>
+    </w:p>
+    <w:p>
+      <w:pPr>
+        <w:numPr>
+          <w:ilvl w:val="0"/>
+          <w:numId w:val="12"/>
+        </w:numPr>
+      </w:pPr>
+      <w:r>
+        <w:t xml:space="preserve">Ek hi database </w:t>
+      </w:r>
+      <w:proofErr w:type="spellStart"/>
+      <w:r>
+        <w:t>mein</w:t>
+      </w:r>
+      <w:proofErr w:type="spellEnd"/>
+      <w:r>
+        <w:t xml:space="preserve"> </w:t>
+      </w:r>
+      <w:proofErr w:type="spellStart"/>
+      <w:r>
+        <w:t>har</w:t>
+      </w:r>
+      <w:proofErr w:type="spellEnd"/>
+      <w:r>
+        <w:t xml:space="preserve"> user </w:t>
+      </w:r>
+      <w:proofErr w:type="spellStart"/>
+      <w:r>
+        <w:t>ke</w:t>
+      </w:r>
+      <w:proofErr w:type="spellEnd"/>
+      <w:r>
+        <w:t xml:space="preserve"> </w:t>
+      </w:r>
+      <w:proofErr w:type="spellStart"/>
+      <w:r>
+        <w:t>liye</w:t>
+      </w:r>
+      <w:proofErr w:type="spellEnd"/>
+      <w:r>
+        <w:t xml:space="preserve"> </w:t>
+      </w:r>
+      <w:proofErr w:type="spellStart"/>
+      <w:r>
+        <w:t>alag</w:t>
+      </w:r>
+      <w:proofErr w:type="spellEnd"/>
+      <w:r>
+        <w:t xml:space="preserve"> "View" </w:t>
+      </w:r>
+      <w:proofErr w:type="spellStart"/>
+      <w:r>
+        <w:t>hota</w:t>
+      </w:r>
+      <w:proofErr w:type="spellEnd"/>
+      <w:r>
+        <w:t xml:space="preserve"> </w:t>
+      </w:r>
+      <w:proofErr w:type="spellStart"/>
+      <w:r>
+        <w:t>hai</w:t>
+      </w:r>
+      <w:proofErr w:type="spellEnd"/>
+      <w:r>
+        <w:t>.</w:t>
+      </w:r>
+    </w:p>
+    <w:p>
+      <w:pPr>
+        <w:rPr>
+          <w:b/>
+          <w:bCs/>
+        </w:rPr>
+      </w:pPr>
+      <w:r>
+        <w:rPr>
+          <w:b/>
+          <w:bCs/>
+        </w:rPr>
+        <w:t>Key Takeaway for your notes:</w:t>
+      </w:r>
+    </w:p>
+    <w:p>
+      <w:r>
+        <w:t xml:space="preserve">"Data Abstraction ek layered approach </w:t>
+      </w:r>
+      <w:proofErr w:type="spellStart"/>
+      <w:r>
+        <w:t>hai</w:t>
+      </w:r>
+      <w:proofErr w:type="spellEnd"/>
+      <w:r>
+        <w:t xml:space="preserve">. </w:t>
+      </w:r>
+      <w:r>
+        <w:rPr>
+          <w:b/>
+          <w:bCs/>
+        </w:rPr>
+        <w:t>Physical Level</w:t>
+      </w:r>
+      <w:r>
+        <w:t xml:space="preserve"> storage ki </w:t>
+      </w:r>
+      <w:proofErr w:type="spellStart"/>
+      <w:r>
+        <w:t>baat</w:t>
+      </w:r>
+      <w:proofErr w:type="spellEnd"/>
+      <w:r>
+        <w:t xml:space="preserve"> </w:t>
+      </w:r>
+      <w:proofErr w:type="spellStart"/>
+      <w:r>
+        <w:t>karta</w:t>
+      </w:r>
+      <w:proofErr w:type="spellEnd"/>
+      <w:r>
+        <w:t xml:space="preserve"> </w:t>
+      </w:r>
+      <w:proofErr w:type="spellStart"/>
+      <w:r>
+        <w:t>hai</w:t>
+      </w:r>
+      <w:proofErr w:type="spellEnd"/>
+      <w:r>
+        <w:t xml:space="preserve">, </w:t>
+      </w:r>
+      <w:r>
+        <w:rPr>
+          <w:b/>
+          <w:bCs/>
+        </w:rPr>
+        <w:t>Logical Level</w:t>
+      </w:r>
+      <w:r>
+        <w:t xml:space="preserve"> structure aur relations ki, aur </w:t>
+      </w:r>
+      <w:r>
+        <w:rPr>
+          <w:b/>
+          <w:bCs/>
+        </w:rPr>
+        <w:t>View Level</w:t>
+      </w:r>
+      <w:r>
+        <w:t xml:space="preserve"> security aur personalization ki. User ko </w:t>
+      </w:r>
+      <w:proofErr w:type="spellStart"/>
+      <w:r>
+        <w:t>sirf</w:t>
+      </w:r>
+      <w:proofErr w:type="spellEnd"/>
+      <w:r>
+        <w:t xml:space="preserve"> </w:t>
+      </w:r>
+      <w:proofErr w:type="spellStart"/>
+      <w:r>
+        <w:t>wahi</w:t>
+      </w:r>
+      <w:proofErr w:type="spellEnd"/>
+      <w:r>
+        <w:t xml:space="preserve"> </w:t>
+      </w:r>
+      <w:proofErr w:type="spellStart"/>
+      <w:r>
+        <w:t>dikhta</w:t>
+      </w:r>
+      <w:proofErr w:type="spellEnd"/>
+      <w:r>
+        <w:t xml:space="preserve"> </w:t>
+      </w:r>
+      <w:proofErr w:type="spellStart"/>
+      <w:r>
+        <w:t>hai</w:t>
+      </w:r>
+      <w:proofErr w:type="spellEnd"/>
+      <w:r>
+        <w:t xml:space="preserve"> jo </w:t>
+      </w:r>
+      <w:proofErr w:type="spellStart"/>
+      <w:r>
+        <w:t>uske</w:t>
+      </w:r>
+      <w:proofErr w:type="spellEnd"/>
+      <w:r>
+        <w:t xml:space="preserve"> role </w:t>
+      </w:r>
+      <w:proofErr w:type="spellStart"/>
+      <w:r>
+        <w:t>ke</w:t>
+      </w:r>
+      <w:proofErr w:type="spellEnd"/>
+      <w:r>
+        <w:t xml:space="preserve"> </w:t>
+      </w:r>
+      <w:proofErr w:type="spellStart"/>
+      <w:r>
+        <w:t>liye</w:t>
+      </w:r>
+      <w:proofErr w:type="spellEnd"/>
+      <w:r>
+        <w:t xml:space="preserve"> </w:t>
+      </w:r>
+      <w:proofErr w:type="spellStart"/>
+      <w:r>
+        <w:t>zaroori</w:t>
+      </w:r>
+      <w:proofErr w:type="spellEnd"/>
+      <w:r>
+        <w:t xml:space="preserve"> </w:t>
+      </w:r>
+      <w:proofErr w:type="spellStart"/>
+      <w:r>
+        <w:t>hai</w:t>
+      </w:r>
+      <w:proofErr w:type="spellEnd"/>
+      <w:r>
+        <w:t>."</w:t>
+      </w:r>
+    </w:p>
+    <w:p>
+      <w:r>
+        <w:pict w14:anchorId="149422E7">
+          <v:rect id="_x0000_i1067" style="width:0;height:1.5pt" o:hralign="center" o:bullet="t" o:hrstd="t" o:hr="t" fillcolor="#a0a0a0" stroked="f"/>
         </w:pict>
       </w:r>
     </w:p>
@@ -4870,17 +6577,22 @@
 <w:numbering xmlns:wpc="http://schemas.microsoft.com/office/word/2010/wordprocessingCanvas" xmlns:cx="http://schemas.microsoft.com/office/drawing/2014/chartex" xmlns:cx1="http://schemas.microsoft.com/office/drawing/2015/9/8/chartex" xmlns:cx2="http://schemas.microsoft.com/office/drawing/2015/10/21/chartex" xmlns:cx3="http://schemas.microsoft.com/office/drawing/2016/5/9/chartex" xmlns:cx4="http://schemas.microsoft.com/office/drawing/2016/5/10/chartex" xmlns:cx5="http://schemas.microsoft.com/office/drawing/2016/5/11/chartex" xmlns:cx6="http://schemas.microsoft.com/office/drawing/2016/5/12/chartex" xmlns:cx7="http://schemas.microsoft.com/office/drawing/2016/5/13/chartex" xmlns:cx8="http://schemas.microsoft.com/office/drawing/2016/5/14/chartex" xmlns:mc="http://schemas.openxmlformats.org/markup-compatibility/2006" xmlns:aink="http://schemas.microsoft.com/office/drawing/2016/ink" xmlns:am3d="http://schemas.microsoft.com/office/drawing/2017/model3d" xmlns:o="urn:schemas-microsoft-com:office:office" xmlns:oel="http://schemas.microsoft.com/office/2019/extlst" xmlns:r="http://schemas.openxmlformats.org/officeDocument/2006/relationships" xmlns:m="http://schemas.openxmlformats.org/officeDocument/2006/math" xmlns:v="urn:schemas-microsoft-com:vml" xmlns:wp14="http://schemas.microsoft.com/office/word/2010/wordprocessingDrawing" xmlns:wp="http://schemas.openxmlformats.org/drawingml/2006/wordprocessingDrawing" xmlns:w10="urn:schemas-microsoft-com:office:word" xmlns:w="http://schemas.openxmlformats.org/wordprocessingml/2006/main" xmlns:w14="http://schemas.microsoft.com/office/word/2010/wordml" xmlns:w15="http://schemas.microsoft.com/office/word/2012/wordml" xmlns:w16cex="http://schemas.microsoft.com/office/word/2018/wordml/cex" xmlns:w16cid="http://schemas.microsoft.com/office/word/2016/wordml/cid" xmlns:w16="http://schemas.microsoft.com/office/word/2018/wordml" xmlns:w16du="http://schemas.microsoft.com/office/word/2023/wordml/word16du" xmlns:w16sdtdh="http://schemas.microsoft.com/office/word/2020/wordml/sdtdatahash" xmlns:w16sdtfl="http://schemas.microsoft.com/office/word/2024/wordml/sdtformatlock" xmlns:w16se="http://schemas.microsoft.com/office/word/2015/wordml/symex" xmlns:wpg="http://schemas.microsoft.com/office/word/2010/wordprocessingGroup" xmlns:wpi="http://schemas.microsoft.com/office/word/2010/wordprocessingInk" xmlns:wne="http://schemas.microsoft.com/office/word/2006/wordml" xmlns:wps="http://schemas.microsoft.com/office/word/2010/wordprocessingShape" mc:Ignorable="w14 w15 w16se w16cid w16 w16cex w16sdtdh w16sdtfl w16du wp14">
   <w:numPicBullet w:numPicBulletId="0">
     <w:pict>
-      <v:rect id="_x0000_i1065" style="width:0;height:1.5pt" o:hralign="center" o:bullet="t" o:hrstd="t" o:hr="t" fillcolor="#a0a0a0" stroked="f"/>
+      <v:rect id="_x0000_i1103" style="width:0;height:1.5pt" o:hralign="center" o:bullet="t" o:hrstd="t" o:hr="t" fillcolor="#a0a0a0" stroked="f"/>
     </w:pict>
   </w:numPicBullet>
   <w:numPicBullet w:numPicBulletId="1">
     <w:pict>
-      <v:rect id="_x0000_i1066" style="width:0;height:1.5pt" o:hralign="center" o:bullet="t" o:hrstd="t" o:hr="t" fillcolor="#a0a0a0" stroked="f"/>
+      <v:rect id="_x0000_i1104" style="width:0;height:1.5pt" o:hralign="center" o:bullet="t" o:hrstd="t" o:hr="t" fillcolor="#a0a0a0" stroked="f"/>
     </w:pict>
   </w:numPicBullet>
   <w:numPicBullet w:numPicBulletId="2">
     <w:pict>
-      <v:rect id="_x0000_i1067" style="width:0;height:1.5pt" o:hralign="center" o:bullet="t" o:hrstd="t" o:hr="t" fillcolor="#a0a0a0" stroked="f"/>
+      <v:rect id="_x0000_i1105" style="width:0;height:1.5pt" o:hralign="center" o:bullet="t" o:hrstd="t" o:hr="t" fillcolor="#a0a0a0" stroked="f"/>
+    </w:pict>
+  </w:numPicBullet>
+  <w:numPicBullet w:numPicBulletId="3">
+    <w:pict>
+      <v:rect id="_x0000_i1106" style="width:0;height:1.5pt" o:hralign="center" o:bullet="t" o:hrstd="t" o:hr="t" fillcolor="#a0a0a0" stroked="f"/>
     </w:pict>
   </w:numPicBullet>
   <w:abstractNum w:abstractNumId="0" w15:restartNumberingAfterBreak="0">
@@ -5895,6 +7607,155 @@
     </w:lvl>
   </w:abstractNum>
   <w:abstractNum w:abstractNumId="7" w15:restartNumberingAfterBreak="0">
+    <w:nsid w:val="549E7094"/>
+    <w:multiLevelType w:val="multilevel"/>
+    <w:tmpl w:val="5F9AF5F4"/>
+    <w:lvl w:ilvl="0">
+      <w:start w:val="1"/>
+      <w:numFmt w:val="bullet"/>
+      <w:lvlText w:val=""/>
+      <w:lvlJc w:val="left"/>
+      <w:pPr>
+        <w:tabs>
+          <w:tab w:val="num" w:pos="720"/>
+        </w:tabs>
+        <w:ind w:left="720" w:hanging="360"/>
+      </w:pPr>
+      <w:rPr>
+        <w:rFonts w:ascii="Symbol" w:hAnsi="Symbol" w:hint="default"/>
+        <w:sz w:val="20"/>
+      </w:rPr>
+    </w:lvl>
+    <w:lvl w:ilvl="1" w:tentative="1">
+      <w:start w:val="1"/>
+      <w:numFmt w:val="bullet"/>
+      <w:lvlText w:val="o"/>
+      <w:lvlJc w:val="left"/>
+      <w:pPr>
+        <w:tabs>
+          <w:tab w:val="num" w:pos="1440"/>
+        </w:tabs>
+        <w:ind w:left="1440" w:hanging="360"/>
+      </w:pPr>
+      <w:rPr>
+        <w:rFonts w:ascii="Courier New" w:hAnsi="Courier New" w:hint="default"/>
+        <w:sz w:val="20"/>
+      </w:rPr>
+    </w:lvl>
+    <w:lvl w:ilvl="2" w:tentative="1">
+      <w:start w:val="1"/>
+      <w:numFmt w:val="bullet"/>
+      <w:lvlText w:val=""/>
+      <w:lvlJc w:val="left"/>
+      <w:pPr>
+        <w:tabs>
+          <w:tab w:val="num" w:pos="2160"/>
+        </w:tabs>
+        <w:ind w:left="2160" w:hanging="360"/>
+      </w:pPr>
+      <w:rPr>
+        <w:rFonts w:ascii="Wingdings" w:hAnsi="Wingdings" w:hint="default"/>
+        <w:sz w:val="20"/>
+      </w:rPr>
+    </w:lvl>
+    <w:lvl w:ilvl="3" w:tentative="1">
+      <w:start w:val="1"/>
+      <w:numFmt w:val="bullet"/>
+      <w:lvlText w:val=""/>
+      <w:lvlJc w:val="left"/>
+      <w:pPr>
+        <w:tabs>
+          <w:tab w:val="num" w:pos="2880"/>
+        </w:tabs>
+        <w:ind w:left="2880" w:hanging="360"/>
+      </w:pPr>
+      <w:rPr>
+        <w:rFonts w:ascii="Wingdings" w:hAnsi="Wingdings" w:hint="default"/>
+        <w:sz w:val="20"/>
+      </w:rPr>
+    </w:lvl>
+    <w:lvl w:ilvl="4" w:tentative="1">
+      <w:start w:val="1"/>
+      <w:numFmt w:val="bullet"/>
+      <w:lvlText w:val=""/>
+      <w:lvlJc w:val="left"/>
+      <w:pPr>
+        <w:tabs>
+          <w:tab w:val="num" w:pos="3600"/>
+        </w:tabs>
+        <w:ind w:left="3600" w:hanging="360"/>
+      </w:pPr>
+      <w:rPr>
+        <w:rFonts w:ascii="Wingdings" w:hAnsi="Wingdings" w:hint="default"/>
+        <w:sz w:val="20"/>
+      </w:rPr>
+    </w:lvl>
+    <w:lvl w:ilvl="5" w:tentative="1">
+      <w:start w:val="1"/>
+      <w:numFmt w:val="bullet"/>
+      <w:lvlText w:val=""/>
+      <w:lvlJc w:val="left"/>
+      <w:pPr>
+        <w:tabs>
+          <w:tab w:val="num" w:pos="4320"/>
+        </w:tabs>
+        <w:ind w:left="4320" w:hanging="360"/>
+      </w:pPr>
+      <w:rPr>
+        <w:rFonts w:ascii="Wingdings" w:hAnsi="Wingdings" w:hint="default"/>
+        <w:sz w:val="20"/>
+      </w:rPr>
+    </w:lvl>
+    <w:lvl w:ilvl="6" w:tentative="1">
+      <w:start w:val="1"/>
+      <w:numFmt w:val="bullet"/>
+      <w:lvlText w:val=""/>
+      <w:lvlJc w:val="left"/>
+      <w:pPr>
+        <w:tabs>
+          <w:tab w:val="num" w:pos="5040"/>
+        </w:tabs>
+        <w:ind w:left="5040" w:hanging="360"/>
+      </w:pPr>
+      <w:rPr>
+        <w:rFonts w:ascii="Wingdings" w:hAnsi="Wingdings" w:hint="default"/>
+        <w:sz w:val="20"/>
+      </w:rPr>
+    </w:lvl>
+    <w:lvl w:ilvl="7" w:tentative="1">
+      <w:start w:val="1"/>
+      <w:numFmt w:val="bullet"/>
+      <w:lvlText w:val=""/>
+      <w:lvlJc w:val="left"/>
+      <w:pPr>
+        <w:tabs>
+          <w:tab w:val="num" w:pos="5760"/>
+        </w:tabs>
+        <w:ind w:left="5760" w:hanging="360"/>
+      </w:pPr>
+      <w:rPr>
+        <w:rFonts w:ascii="Wingdings" w:hAnsi="Wingdings" w:hint="default"/>
+        <w:sz w:val="20"/>
+      </w:rPr>
+    </w:lvl>
+    <w:lvl w:ilvl="8" w:tentative="1">
+      <w:start w:val="1"/>
+      <w:numFmt w:val="bullet"/>
+      <w:lvlText w:val=""/>
+      <w:lvlJc w:val="left"/>
+      <w:pPr>
+        <w:tabs>
+          <w:tab w:val="num" w:pos="6480"/>
+        </w:tabs>
+        <w:ind w:left="6480" w:hanging="360"/>
+      </w:pPr>
+      <w:rPr>
+        <w:rFonts w:ascii="Wingdings" w:hAnsi="Wingdings" w:hint="default"/>
+        <w:sz w:val="20"/>
+      </w:rPr>
+    </w:lvl>
+  </w:abstractNum>
+  <w:abstractNum w:abstractNumId="8" w15:restartNumberingAfterBreak="0">
     <w:nsid w:val="567936F9"/>
     <w:multiLevelType w:val="multilevel"/>
     <w:tmpl w:val="4446AAB4"/>
@@ -6043,7 +7904,7 @@
       </w:rPr>
     </w:lvl>
   </w:abstractNum>
-  <w:abstractNum w:abstractNumId="8" w15:restartNumberingAfterBreak="0">
+  <w:abstractNum w:abstractNumId="9" w15:restartNumberingAfterBreak="0">
     <w:nsid w:val="58575B75"/>
     <w:multiLevelType w:val="multilevel"/>
     <w:tmpl w:val="D1568ACA"/>
@@ -6192,11 +8053,309 @@
       </w:rPr>
     </w:lvl>
   </w:abstractNum>
+  <w:abstractNum w:abstractNumId="10" w15:restartNumberingAfterBreak="0">
+    <w:nsid w:val="67B01BCB"/>
+    <w:multiLevelType w:val="multilevel"/>
+    <w:tmpl w:val="D9F89206"/>
+    <w:lvl w:ilvl="0">
+      <w:start w:val="1"/>
+      <w:numFmt w:val="bullet"/>
+      <w:lvlText w:val=""/>
+      <w:lvlJc w:val="left"/>
+      <w:pPr>
+        <w:tabs>
+          <w:tab w:val="num" w:pos="720"/>
+        </w:tabs>
+        <w:ind w:left="720" w:hanging="360"/>
+      </w:pPr>
+      <w:rPr>
+        <w:rFonts w:ascii="Symbol" w:hAnsi="Symbol" w:hint="default"/>
+        <w:sz w:val="20"/>
+      </w:rPr>
+    </w:lvl>
+    <w:lvl w:ilvl="1">
+      <w:start w:val="1"/>
+      <w:numFmt w:val="bullet"/>
+      <w:lvlText w:val="o"/>
+      <w:lvlJc w:val="left"/>
+      <w:pPr>
+        <w:tabs>
+          <w:tab w:val="num" w:pos="1440"/>
+        </w:tabs>
+        <w:ind w:left="1440" w:hanging="360"/>
+      </w:pPr>
+      <w:rPr>
+        <w:rFonts w:ascii="Courier New" w:hAnsi="Courier New" w:hint="default"/>
+        <w:sz w:val="20"/>
+      </w:rPr>
+    </w:lvl>
+    <w:lvl w:ilvl="2" w:tentative="1">
+      <w:start w:val="1"/>
+      <w:numFmt w:val="bullet"/>
+      <w:lvlText w:val=""/>
+      <w:lvlJc w:val="left"/>
+      <w:pPr>
+        <w:tabs>
+          <w:tab w:val="num" w:pos="2160"/>
+        </w:tabs>
+        <w:ind w:left="2160" w:hanging="360"/>
+      </w:pPr>
+      <w:rPr>
+        <w:rFonts w:ascii="Wingdings" w:hAnsi="Wingdings" w:hint="default"/>
+        <w:sz w:val="20"/>
+      </w:rPr>
+    </w:lvl>
+    <w:lvl w:ilvl="3" w:tentative="1">
+      <w:start w:val="1"/>
+      <w:numFmt w:val="bullet"/>
+      <w:lvlText w:val=""/>
+      <w:lvlJc w:val="left"/>
+      <w:pPr>
+        <w:tabs>
+          <w:tab w:val="num" w:pos="2880"/>
+        </w:tabs>
+        <w:ind w:left="2880" w:hanging="360"/>
+      </w:pPr>
+      <w:rPr>
+        <w:rFonts w:ascii="Wingdings" w:hAnsi="Wingdings" w:hint="default"/>
+        <w:sz w:val="20"/>
+      </w:rPr>
+    </w:lvl>
+    <w:lvl w:ilvl="4" w:tentative="1">
+      <w:start w:val="1"/>
+      <w:numFmt w:val="bullet"/>
+      <w:lvlText w:val=""/>
+      <w:lvlJc w:val="left"/>
+      <w:pPr>
+        <w:tabs>
+          <w:tab w:val="num" w:pos="3600"/>
+        </w:tabs>
+        <w:ind w:left="3600" w:hanging="360"/>
+      </w:pPr>
+      <w:rPr>
+        <w:rFonts w:ascii="Wingdings" w:hAnsi="Wingdings" w:hint="default"/>
+        <w:sz w:val="20"/>
+      </w:rPr>
+    </w:lvl>
+    <w:lvl w:ilvl="5" w:tentative="1">
+      <w:start w:val="1"/>
+      <w:numFmt w:val="bullet"/>
+      <w:lvlText w:val=""/>
+      <w:lvlJc w:val="left"/>
+      <w:pPr>
+        <w:tabs>
+          <w:tab w:val="num" w:pos="4320"/>
+        </w:tabs>
+        <w:ind w:left="4320" w:hanging="360"/>
+      </w:pPr>
+      <w:rPr>
+        <w:rFonts w:ascii="Wingdings" w:hAnsi="Wingdings" w:hint="default"/>
+        <w:sz w:val="20"/>
+      </w:rPr>
+    </w:lvl>
+    <w:lvl w:ilvl="6" w:tentative="1">
+      <w:start w:val="1"/>
+      <w:numFmt w:val="bullet"/>
+      <w:lvlText w:val=""/>
+      <w:lvlJc w:val="left"/>
+      <w:pPr>
+        <w:tabs>
+          <w:tab w:val="num" w:pos="5040"/>
+        </w:tabs>
+        <w:ind w:left="5040" w:hanging="360"/>
+      </w:pPr>
+      <w:rPr>
+        <w:rFonts w:ascii="Wingdings" w:hAnsi="Wingdings" w:hint="default"/>
+        <w:sz w:val="20"/>
+      </w:rPr>
+    </w:lvl>
+    <w:lvl w:ilvl="7" w:tentative="1">
+      <w:start w:val="1"/>
+      <w:numFmt w:val="bullet"/>
+      <w:lvlText w:val=""/>
+      <w:lvlJc w:val="left"/>
+      <w:pPr>
+        <w:tabs>
+          <w:tab w:val="num" w:pos="5760"/>
+        </w:tabs>
+        <w:ind w:left="5760" w:hanging="360"/>
+      </w:pPr>
+      <w:rPr>
+        <w:rFonts w:ascii="Wingdings" w:hAnsi="Wingdings" w:hint="default"/>
+        <w:sz w:val="20"/>
+      </w:rPr>
+    </w:lvl>
+    <w:lvl w:ilvl="8" w:tentative="1">
+      <w:start w:val="1"/>
+      <w:numFmt w:val="bullet"/>
+      <w:lvlText w:val=""/>
+      <w:lvlJc w:val="left"/>
+      <w:pPr>
+        <w:tabs>
+          <w:tab w:val="num" w:pos="6480"/>
+        </w:tabs>
+        <w:ind w:left="6480" w:hanging="360"/>
+      </w:pPr>
+      <w:rPr>
+        <w:rFonts w:ascii="Wingdings" w:hAnsi="Wingdings" w:hint="default"/>
+        <w:sz w:val="20"/>
+      </w:rPr>
+    </w:lvl>
+  </w:abstractNum>
+  <w:abstractNum w:abstractNumId="11" w15:restartNumberingAfterBreak="0">
+    <w:nsid w:val="6A157442"/>
+    <w:multiLevelType w:val="multilevel"/>
+    <w:tmpl w:val="A41EB57E"/>
+    <w:lvl w:ilvl="0">
+      <w:start w:val="1"/>
+      <w:numFmt w:val="bullet"/>
+      <w:lvlText w:val=""/>
+      <w:lvlJc w:val="left"/>
+      <w:pPr>
+        <w:tabs>
+          <w:tab w:val="num" w:pos="720"/>
+        </w:tabs>
+        <w:ind w:left="720" w:hanging="360"/>
+      </w:pPr>
+      <w:rPr>
+        <w:rFonts w:ascii="Symbol" w:hAnsi="Symbol" w:hint="default"/>
+        <w:sz w:val="20"/>
+      </w:rPr>
+    </w:lvl>
+    <w:lvl w:ilvl="1" w:tentative="1">
+      <w:start w:val="1"/>
+      <w:numFmt w:val="bullet"/>
+      <w:lvlText w:val="o"/>
+      <w:lvlJc w:val="left"/>
+      <w:pPr>
+        <w:tabs>
+          <w:tab w:val="num" w:pos="1440"/>
+        </w:tabs>
+        <w:ind w:left="1440" w:hanging="360"/>
+      </w:pPr>
+      <w:rPr>
+        <w:rFonts w:ascii="Courier New" w:hAnsi="Courier New" w:hint="default"/>
+        <w:sz w:val="20"/>
+      </w:rPr>
+    </w:lvl>
+    <w:lvl w:ilvl="2" w:tentative="1">
+      <w:start w:val="1"/>
+      <w:numFmt w:val="bullet"/>
+      <w:lvlText w:val=""/>
+      <w:lvlJc w:val="left"/>
+      <w:pPr>
+        <w:tabs>
+          <w:tab w:val="num" w:pos="2160"/>
+        </w:tabs>
+        <w:ind w:left="2160" w:hanging="360"/>
+      </w:pPr>
+      <w:rPr>
+        <w:rFonts w:ascii="Wingdings" w:hAnsi="Wingdings" w:hint="default"/>
+        <w:sz w:val="20"/>
+      </w:rPr>
+    </w:lvl>
+    <w:lvl w:ilvl="3" w:tentative="1">
+      <w:start w:val="1"/>
+      <w:numFmt w:val="bullet"/>
+      <w:lvlText w:val=""/>
+      <w:lvlJc w:val="left"/>
+      <w:pPr>
+        <w:tabs>
+          <w:tab w:val="num" w:pos="2880"/>
+        </w:tabs>
+        <w:ind w:left="2880" w:hanging="360"/>
+      </w:pPr>
+      <w:rPr>
+        <w:rFonts w:ascii="Wingdings" w:hAnsi="Wingdings" w:hint="default"/>
+        <w:sz w:val="20"/>
+      </w:rPr>
+    </w:lvl>
+    <w:lvl w:ilvl="4" w:tentative="1">
+      <w:start w:val="1"/>
+      <w:numFmt w:val="bullet"/>
+      <w:lvlText w:val=""/>
+      <w:lvlJc w:val="left"/>
+      <w:pPr>
+        <w:tabs>
+          <w:tab w:val="num" w:pos="3600"/>
+        </w:tabs>
+        <w:ind w:left="3600" w:hanging="360"/>
+      </w:pPr>
+      <w:rPr>
+        <w:rFonts w:ascii="Wingdings" w:hAnsi="Wingdings" w:hint="default"/>
+        <w:sz w:val="20"/>
+      </w:rPr>
+    </w:lvl>
+    <w:lvl w:ilvl="5" w:tentative="1">
+      <w:start w:val="1"/>
+      <w:numFmt w:val="bullet"/>
+      <w:lvlText w:val=""/>
+      <w:lvlJc w:val="left"/>
+      <w:pPr>
+        <w:tabs>
+          <w:tab w:val="num" w:pos="4320"/>
+        </w:tabs>
+        <w:ind w:left="4320" w:hanging="360"/>
+      </w:pPr>
+      <w:rPr>
+        <w:rFonts w:ascii="Wingdings" w:hAnsi="Wingdings" w:hint="default"/>
+        <w:sz w:val="20"/>
+      </w:rPr>
+    </w:lvl>
+    <w:lvl w:ilvl="6" w:tentative="1">
+      <w:start w:val="1"/>
+      <w:numFmt w:val="bullet"/>
+      <w:lvlText w:val=""/>
+      <w:lvlJc w:val="left"/>
+      <w:pPr>
+        <w:tabs>
+          <w:tab w:val="num" w:pos="5040"/>
+        </w:tabs>
+        <w:ind w:left="5040" w:hanging="360"/>
+      </w:pPr>
+      <w:rPr>
+        <w:rFonts w:ascii="Wingdings" w:hAnsi="Wingdings" w:hint="default"/>
+        <w:sz w:val="20"/>
+      </w:rPr>
+    </w:lvl>
+    <w:lvl w:ilvl="7" w:tentative="1">
+      <w:start w:val="1"/>
+      <w:numFmt w:val="bullet"/>
+      <w:lvlText w:val=""/>
+      <w:lvlJc w:val="left"/>
+      <w:pPr>
+        <w:tabs>
+          <w:tab w:val="num" w:pos="5760"/>
+        </w:tabs>
+        <w:ind w:left="5760" w:hanging="360"/>
+      </w:pPr>
+      <w:rPr>
+        <w:rFonts w:ascii="Wingdings" w:hAnsi="Wingdings" w:hint="default"/>
+        <w:sz w:val="20"/>
+      </w:rPr>
+    </w:lvl>
+    <w:lvl w:ilvl="8" w:tentative="1">
+      <w:start w:val="1"/>
+      <w:numFmt w:val="bullet"/>
+      <w:lvlText w:val=""/>
+      <w:lvlJc w:val="left"/>
+      <w:pPr>
+        <w:tabs>
+          <w:tab w:val="num" w:pos="6480"/>
+        </w:tabs>
+        <w:ind w:left="6480" w:hanging="360"/>
+      </w:pPr>
+      <w:rPr>
+        <w:rFonts w:ascii="Wingdings" w:hAnsi="Wingdings" w:hint="default"/>
+        <w:sz w:val="20"/>
+      </w:rPr>
+    </w:lvl>
+  </w:abstractNum>
   <w:num w:numId="1" w16cid:durableId="490487340">
-    <w:abstractNumId w:val="7"/>
+    <w:abstractNumId w:val="8"/>
   </w:num>
   <w:num w:numId="2" w16cid:durableId="1913272450">
-    <w:abstractNumId w:val="8"/>
+    <w:abstractNumId w:val="9"/>
   </w:num>
   <w:num w:numId="3" w16cid:durableId="688718240">
     <w:abstractNumId w:val="4"/>
@@ -6218,6 +8377,15 @@
   </w:num>
   <w:num w:numId="9" w16cid:durableId="109781556">
     <w:abstractNumId w:val="2"/>
+  </w:num>
+  <w:num w:numId="10" w16cid:durableId="707532573">
+    <w:abstractNumId w:val="7"/>
+  </w:num>
+  <w:num w:numId="11" w16cid:durableId="356277149">
+    <w:abstractNumId w:val="11"/>
+  </w:num>
+  <w:num w:numId="12" w16cid:durableId="1055659636">
+    <w:abstractNumId w:val="10"/>
   </w:num>
 </w:numbering>
 </file>

</xml_diff>